<commit_message>
feat: update settings with new Bash commands and modify multiple annex documents for data protection compliance
</commit_message>
<xml_diff>
--- a/02_NORMAS/I01 Normativa de Seguridad de la Información.docx
+++ b/02_NORMAS/I01 Normativa de Seguridad de la Información.docx
@@ -46,7 +46,7 @@
           <wp:inline distT="0" distB="0" distL="0" distR="0" wp14:anchorId="6CC6654C" wp14:editId="1761DCD6">
             <wp:extent cx="3895200" cy="1584000"/>
             <wp:effectExtent l="0" t="0" r="0" b="0"/>
-            <wp:docPr id="619107161" name="Imatge 69" descr="Imatge que conté Gràfics, Font, disseny gràfic, logotip&#10;&#10;Pot ser que el contingut generat per IA no sigui correcte.">
+            <wp:docPr id="619107161" name="Imatge 69" descr="Imatge que conté Gràfics, Font, disseny gràfic, logotip  Pot ser que el contingut generat per IA no sigui correcte.">
               <a:extLst xmlns:a="http://schemas.openxmlformats.org/drawingml/2006/main">
                 <a:ext uri="{FF2B5EF4-FFF2-40B4-BE49-F238E27FC236}">
                   <a16:creationId xmlns:a16="http://schemas.microsoft.com/office/drawing/2014/main" id="{83CA7420-D495-4F41-9903-64F683A46824}"/>
@@ -60,7 +60,7 @@
               <a:graphicData uri="http://schemas.openxmlformats.org/drawingml/2006/picture">
                 <pic:pic xmlns:pic="http://schemas.openxmlformats.org/drawingml/2006/picture">
                   <pic:nvPicPr>
-                    <pic:cNvPr id="156031891" name="Imatge 69" descr="Imatge que conté Gràfics, Font, disseny gràfic, logotip&#10;&#10;Pot ser que el contingut generat per IA no sigui correcte."/>
+                    <pic:cNvPr id="156031891" name="Imatge 69" descr="Imatge que conté Gràfics, Font, disseny gràfic, logotip  Pot ser que el contingut generat per IA no sigui correcte."/>
                     <pic:cNvPicPr/>
                   </pic:nvPicPr>
                   <pic:blipFill>
@@ -337,17 +337,7 @@
           <w:lang w:val="es-ES_tradnl"/>
         </w:rPr>
         <w:fldChar w:fldCharType="begin"/>
-      </w:r>
-      <w:r>
-        <w:rPr>
-          <w:lang w:val="es-ES_tradnl"/>
-        </w:rPr>
         <w:instrText xml:space="preserve"> TOC \o "1-3" \h \z \u </w:instrText>
-      </w:r>
-      <w:r>
-        <w:rPr>
-          <w:lang w:val="es-ES_tradnl"/>
-        </w:rPr>
         <w:fldChar w:fldCharType="separate"/>
       </w:r>
       <w:hyperlink w:anchor="_Toc203646884" w:history="1">
@@ -386,52 +376,10 @@
             <w:lang w:val="es-ES_tradnl"/>
           </w:rPr>
           <w:tab/>
-        </w:r>
-        <w:r>
-          <w:rPr>
-            <w:noProof/>
-            <w:webHidden/>
-            <w:lang w:val="es-ES_tradnl"/>
-          </w:rPr>
           <w:fldChar w:fldCharType="begin"/>
-        </w:r>
-        <w:r>
-          <w:rPr>
-            <w:noProof/>
-            <w:webHidden/>
-            <w:lang w:val="es-ES_tradnl"/>
-          </w:rPr>
           <w:instrText xml:space="preserve"> PAGEREF _Toc203646884 \h </w:instrText>
-        </w:r>
-        <w:r>
-          <w:rPr>
-            <w:noProof/>
-            <w:webHidden/>
-            <w:lang w:val="es-ES_tradnl"/>
-          </w:rPr>
-        </w:r>
-        <w:r>
-          <w:rPr>
-            <w:noProof/>
-            <w:webHidden/>
-            <w:lang w:val="es-ES_tradnl"/>
-          </w:rPr>
           <w:fldChar w:fldCharType="separate"/>
-        </w:r>
-        <w:r>
-          <w:rPr>
-            <w:noProof/>
-            <w:webHidden/>
-            <w:lang w:val="es-ES_tradnl"/>
-          </w:rPr>
           <w:t>4</w:t>
-        </w:r>
-        <w:r>
-          <w:rPr>
-            <w:noProof/>
-            <w:webHidden/>
-            <w:lang w:val="es-ES_tradnl"/>
-          </w:rPr>
           <w:fldChar w:fldCharType="end"/>
         </w:r>
       </w:hyperlink>
@@ -485,52 +433,10 @@
             <w:lang w:val="es-ES_tradnl"/>
           </w:rPr>
           <w:tab/>
-        </w:r>
-        <w:r>
-          <w:rPr>
-            <w:noProof/>
-            <w:webHidden/>
-            <w:lang w:val="es-ES_tradnl"/>
-          </w:rPr>
           <w:fldChar w:fldCharType="begin"/>
-        </w:r>
-        <w:r>
-          <w:rPr>
-            <w:noProof/>
-            <w:webHidden/>
-            <w:lang w:val="es-ES_tradnl"/>
-          </w:rPr>
           <w:instrText xml:space="preserve"> PAGEREF _Toc203646885 \h </w:instrText>
-        </w:r>
-        <w:r>
-          <w:rPr>
-            <w:noProof/>
-            <w:webHidden/>
-            <w:lang w:val="es-ES_tradnl"/>
-          </w:rPr>
-        </w:r>
-        <w:r>
-          <w:rPr>
-            <w:noProof/>
-            <w:webHidden/>
-            <w:lang w:val="es-ES_tradnl"/>
-          </w:rPr>
           <w:fldChar w:fldCharType="separate"/>
-        </w:r>
-        <w:r>
-          <w:rPr>
-            <w:noProof/>
-            <w:webHidden/>
-            <w:lang w:val="es-ES_tradnl"/>
-          </w:rPr>
           <w:t>4</w:t>
-        </w:r>
-        <w:r>
-          <w:rPr>
-            <w:noProof/>
-            <w:webHidden/>
-            <w:lang w:val="es-ES_tradnl"/>
-          </w:rPr>
           <w:fldChar w:fldCharType="end"/>
         </w:r>
       </w:hyperlink>
@@ -584,52 +490,10 @@
             <w:lang w:val="es-ES_tradnl"/>
           </w:rPr>
           <w:tab/>
-        </w:r>
-        <w:r>
-          <w:rPr>
-            <w:noProof/>
-            <w:webHidden/>
-            <w:lang w:val="es-ES_tradnl"/>
-          </w:rPr>
           <w:fldChar w:fldCharType="begin"/>
-        </w:r>
-        <w:r>
-          <w:rPr>
-            <w:noProof/>
-            <w:webHidden/>
-            <w:lang w:val="es-ES_tradnl"/>
-          </w:rPr>
           <w:instrText xml:space="preserve"> PAGEREF _Toc203646886 \h </w:instrText>
-        </w:r>
-        <w:r>
-          <w:rPr>
-            <w:noProof/>
-            <w:webHidden/>
-            <w:lang w:val="es-ES_tradnl"/>
-          </w:rPr>
-        </w:r>
-        <w:r>
-          <w:rPr>
-            <w:noProof/>
-            <w:webHidden/>
-            <w:lang w:val="es-ES_tradnl"/>
-          </w:rPr>
           <w:fldChar w:fldCharType="separate"/>
-        </w:r>
-        <w:r>
-          <w:rPr>
-            <w:noProof/>
-            <w:webHidden/>
-            <w:lang w:val="es-ES_tradnl"/>
-          </w:rPr>
           <w:t>4</w:t>
-        </w:r>
-        <w:r>
-          <w:rPr>
-            <w:noProof/>
-            <w:webHidden/>
-            <w:lang w:val="es-ES_tradnl"/>
-          </w:rPr>
           <w:fldChar w:fldCharType="end"/>
         </w:r>
       </w:hyperlink>
@@ -683,52 +547,10 @@
             <w:lang w:val="es-ES_tradnl"/>
           </w:rPr>
           <w:tab/>
-        </w:r>
-        <w:r>
-          <w:rPr>
-            <w:noProof/>
-            <w:webHidden/>
-            <w:lang w:val="es-ES_tradnl"/>
-          </w:rPr>
           <w:fldChar w:fldCharType="begin"/>
-        </w:r>
-        <w:r>
-          <w:rPr>
-            <w:noProof/>
-            <w:webHidden/>
-            <w:lang w:val="es-ES_tradnl"/>
-          </w:rPr>
           <w:instrText xml:space="preserve"> PAGEREF _Toc203646887 \h </w:instrText>
-        </w:r>
-        <w:r>
-          <w:rPr>
-            <w:noProof/>
-            <w:webHidden/>
-            <w:lang w:val="es-ES_tradnl"/>
-          </w:rPr>
-        </w:r>
-        <w:r>
-          <w:rPr>
-            <w:noProof/>
-            <w:webHidden/>
-            <w:lang w:val="es-ES_tradnl"/>
-          </w:rPr>
           <w:fldChar w:fldCharType="separate"/>
-        </w:r>
-        <w:r>
-          <w:rPr>
-            <w:noProof/>
-            <w:webHidden/>
-            <w:lang w:val="es-ES_tradnl"/>
-          </w:rPr>
           <w:t>4</w:t>
-        </w:r>
-        <w:r>
-          <w:rPr>
-            <w:noProof/>
-            <w:webHidden/>
-            <w:lang w:val="es-ES_tradnl"/>
-          </w:rPr>
           <w:fldChar w:fldCharType="end"/>
         </w:r>
       </w:hyperlink>
@@ -782,52 +604,10 @@
             <w:lang w:val="es-ES_tradnl"/>
           </w:rPr>
           <w:tab/>
-        </w:r>
-        <w:r>
-          <w:rPr>
-            <w:noProof/>
-            <w:webHidden/>
-            <w:lang w:val="es-ES_tradnl"/>
-          </w:rPr>
           <w:fldChar w:fldCharType="begin"/>
-        </w:r>
-        <w:r>
-          <w:rPr>
-            <w:noProof/>
-            <w:webHidden/>
-            <w:lang w:val="es-ES_tradnl"/>
-          </w:rPr>
           <w:instrText xml:space="preserve"> PAGEREF _Toc203646888 \h </w:instrText>
-        </w:r>
-        <w:r>
-          <w:rPr>
-            <w:noProof/>
-            <w:webHidden/>
-            <w:lang w:val="es-ES_tradnl"/>
-          </w:rPr>
-        </w:r>
-        <w:r>
-          <w:rPr>
-            <w:noProof/>
-            <w:webHidden/>
-            <w:lang w:val="es-ES_tradnl"/>
-          </w:rPr>
           <w:fldChar w:fldCharType="separate"/>
-        </w:r>
-        <w:r>
-          <w:rPr>
-            <w:noProof/>
-            <w:webHidden/>
-            <w:lang w:val="es-ES_tradnl"/>
-          </w:rPr>
           <w:t>4</w:t>
-        </w:r>
-        <w:r>
-          <w:rPr>
-            <w:noProof/>
-            <w:webHidden/>
-            <w:lang w:val="es-ES_tradnl"/>
-          </w:rPr>
           <w:fldChar w:fldCharType="end"/>
         </w:r>
       </w:hyperlink>
@@ -881,52 +661,10 @@
             <w:lang w:val="es-ES_tradnl"/>
           </w:rPr>
           <w:tab/>
-        </w:r>
-        <w:r>
-          <w:rPr>
-            <w:noProof/>
-            <w:webHidden/>
-            <w:lang w:val="es-ES_tradnl"/>
-          </w:rPr>
           <w:fldChar w:fldCharType="begin"/>
-        </w:r>
-        <w:r>
-          <w:rPr>
-            <w:noProof/>
-            <w:webHidden/>
-            <w:lang w:val="es-ES_tradnl"/>
-          </w:rPr>
           <w:instrText xml:space="preserve"> PAGEREF _Toc203646889 \h </w:instrText>
-        </w:r>
-        <w:r>
-          <w:rPr>
-            <w:noProof/>
-            <w:webHidden/>
-            <w:lang w:val="es-ES_tradnl"/>
-          </w:rPr>
-        </w:r>
-        <w:r>
-          <w:rPr>
-            <w:noProof/>
-            <w:webHidden/>
-            <w:lang w:val="es-ES_tradnl"/>
-          </w:rPr>
           <w:fldChar w:fldCharType="separate"/>
-        </w:r>
-        <w:r>
-          <w:rPr>
-            <w:noProof/>
-            <w:webHidden/>
-            <w:lang w:val="es-ES_tradnl"/>
-          </w:rPr>
           <w:t>5</w:t>
-        </w:r>
-        <w:r>
-          <w:rPr>
-            <w:noProof/>
-            <w:webHidden/>
-            <w:lang w:val="es-ES_tradnl"/>
-          </w:rPr>
           <w:fldChar w:fldCharType="end"/>
         </w:r>
       </w:hyperlink>
@@ -984,52 +722,10 @@
             <w:lang w:val="es-ES_tradnl"/>
           </w:rPr>
           <w:tab/>
-        </w:r>
-        <w:r>
-          <w:rPr>
-            <w:noProof/>
-            <w:webHidden/>
-            <w:lang w:val="es-ES_tradnl"/>
-          </w:rPr>
           <w:fldChar w:fldCharType="begin"/>
-        </w:r>
-        <w:r>
-          <w:rPr>
-            <w:noProof/>
-            <w:webHidden/>
-            <w:lang w:val="es-ES_tradnl"/>
-          </w:rPr>
           <w:instrText xml:space="preserve"> PAGEREF _Toc203646890 \h </w:instrText>
-        </w:r>
-        <w:r>
-          <w:rPr>
-            <w:noProof/>
-            <w:webHidden/>
-            <w:lang w:val="es-ES_tradnl"/>
-          </w:rPr>
-        </w:r>
-        <w:r>
-          <w:rPr>
-            <w:noProof/>
-            <w:webHidden/>
-            <w:lang w:val="es-ES_tradnl"/>
-          </w:rPr>
           <w:fldChar w:fldCharType="separate"/>
-        </w:r>
-        <w:r>
-          <w:rPr>
-            <w:noProof/>
-            <w:webHidden/>
-            <w:lang w:val="es-ES_tradnl"/>
-          </w:rPr>
           <w:t>5</w:t>
-        </w:r>
-        <w:r>
-          <w:rPr>
-            <w:noProof/>
-            <w:webHidden/>
-            <w:lang w:val="es-ES_tradnl"/>
-          </w:rPr>
           <w:fldChar w:fldCharType="end"/>
         </w:r>
       </w:hyperlink>
@@ -1087,52 +783,10 @@
             <w:lang w:val="es-ES_tradnl"/>
           </w:rPr>
           <w:tab/>
-        </w:r>
-        <w:r>
-          <w:rPr>
-            <w:noProof/>
-            <w:webHidden/>
-            <w:lang w:val="es-ES_tradnl"/>
-          </w:rPr>
           <w:fldChar w:fldCharType="begin"/>
-        </w:r>
-        <w:r>
-          <w:rPr>
-            <w:noProof/>
-            <w:webHidden/>
-            <w:lang w:val="es-ES_tradnl"/>
-          </w:rPr>
           <w:instrText xml:space="preserve"> PAGEREF _Toc203646891 \h </w:instrText>
-        </w:r>
-        <w:r>
-          <w:rPr>
-            <w:noProof/>
-            <w:webHidden/>
-            <w:lang w:val="es-ES_tradnl"/>
-          </w:rPr>
-        </w:r>
-        <w:r>
-          <w:rPr>
-            <w:noProof/>
-            <w:webHidden/>
-            <w:lang w:val="es-ES_tradnl"/>
-          </w:rPr>
           <w:fldChar w:fldCharType="separate"/>
-        </w:r>
-        <w:r>
-          <w:rPr>
-            <w:noProof/>
-            <w:webHidden/>
-            <w:lang w:val="es-ES_tradnl"/>
-          </w:rPr>
           <w:t>7</w:t>
-        </w:r>
-        <w:r>
-          <w:rPr>
-            <w:noProof/>
-            <w:webHidden/>
-            <w:lang w:val="es-ES_tradnl"/>
-          </w:rPr>
           <w:fldChar w:fldCharType="end"/>
         </w:r>
       </w:hyperlink>
@@ -1190,52 +844,10 @@
             <w:lang w:val="es-ES_tradnl"/>
           </w:rPr>
           <w:tab/>
-        </w:r>
-        <w:r>
-          <w:rPr>
-            <w:noProof/>
-            <w:webHidden/>
-            <w:lang w:val="es-ES_tradnl"/>
-          </w:rPr>
           <w:fldChar w:fldCharType="begin"/>
-        </w:r>
-        <w:r>
-          <w:rPr>
-            <w:noProof/>
-            <w:webHidden/>
-            <w:lang w:val="es-ES_tradnl"/>
-          </w:rPr>
           <w:instrText xml:space="preserve"> PAGEREF _Toc203646892 \h </w:instrText>
-        </w:r>
-        <w:r>
-          <w:rPr>
-            <w:noProof/>
-            <w:webHidden/>
-            <w:lang w:val="es-ES_tradnl"/>
-          </w:rPr>
-        </w:r>
-        <w:r>
-          <w:rPr>
-            <w:noProof/>
-            <w:webHidden/>
-            <w:lang w:val="es-ES_tradnl"/>
-          </w:rPr>
           <w:fldChar w:fldCharType="separate"/>
-        </w:r>
-        <w:r>
-          <w:rPr>
-            <w:noProof/>
-            <w:webHidden/>
-            <w:lang w:val="es-ES_tradnl"/>
-          </w:rPr>
           <w:t>7</w:t>
-        </w:r>
-        <w:r>
-          <w:rPr>
-            <w:noProof/>
-            <w:webHidden/>
-            <w:lang w:val="es-ES_tradnl"/>
-          </w:rPr>
           <w:fldChar w:fldCharType="end"/>
         </w:r>
       </w:hyperlink>
@@ -1293,52 +905,10 @@
             <w:lang w:val="es-ES_tradnl"/>
           </w:rPr>
           <w:tab/>
-        </w:r>
-        <w:r>
-          <w:rPr>
-            <w:noProof/>
-            <w:webHidden/>
-            <w:lang w:val="es-ES_tradnl"/>
-          </w:rPr>
           <w:fldChar w:fldCharType="begin"/>
-        </w:r>
-        <w:r>
-          <w:rPr>
-            <w:noProof/>
-            <w:webHidden/>
-            <w:lang w:val="es-ES_tradnl"/>
-          </w:rPr>
           <w:instrText xml:space="preserve"> PAGEREF _Toc203646893 \h </w:instrText>
-        </w:r>
-        <w:r>
-          <w:rPr>
-            <w:noProof/>
-            <w:webHidden/>
-            <w:lang w:val="es-ES_tradnl"/>
-          </w:rPr>
-        </w:r>
-        <w:r>
-          <w:rPr>
-            <w:noProof/>
-            <w:webHidden/>
-            <w:lang w:val="es-ES_tradnl"/>
-          </w:rPr>
           <w:fldChar w:fldCharType="separate"/>
-        </w:r>
-        <w:r>
-          <w:rPr>
-            <w:noProof/>
-            <w:webHidden/>
-            <w:lang w:val="es-ES_tradnl"/>
-          </w:rPr>
           <w:t>7</w:t>
-        </w:r>
-        <w:r>
-          <w:rPr>
-            <w:noProof/>
-            <w:webHidden/>
-            <w:lang w:val="es-ES_tradnl"/>
-          </w:rPr>
           <w:fldChar w:fldCharType="end"/>
         </w:r>
       </w:hyperlink>
@@ -1392,52 +962,10 @@
             <w:lang w:val="es-ES_tradnl"/>
           </w:rPr>
           <w:tab/>
-        </w:r>
-        <w:r>
-          <w:rPr>
-            <w:noProof/>
-            <w:webHidden/>
-            <w:lang w:val="es-ES_tradnl"/>
-          </w:rPr>
           <w:fldChar w:fldCharType="begin"/>
-        </w:r>
-        <w:r>
-          <w:rPr>
-            <w:noProof/>
-            <w:webHidden/>
-            <w:lang w:val="es-ES_tradnl"/>
-          </w:rPr>
           <w:instrText xml:space="preserve"> PAGEREF _Toc203646894 \h </w:instrText>
-        </w:r>
-        <w:r>
-          <w:rPr>
-            <w:noProof/>
-            <w:webHidden/>
-            <w:lang w:val="es-ES_tradnl"/>
-          </w:rPr>
-        </w:r>
-        <w:r>
-          <w:rPr>
-            <w:noProof/>
-            <w:webHidden/>
-            <w:lang w:val="es-ES_tradnl"/>
-          </w:rPr>
           <w:fldChar w:fldCharType="separate"/>
-        </w:r>
-        <w:r>
-          <w:rPr>
-            <w:noProof/>
-            <w:webHidden/>
-            <w:lang w:val="es-ES_tradnl"/>
-          </w:rPr>
           <w:t>8</w:t>
-        </w:r>
-        <w:r>
-          <w:rPr>
-            <w:noProof/>
-            <w:webHidden/>
-            <w:lang w:val="es-ES_tradnl"/>
-          </w:rPr>
           <w:fldChar w:fldCharType="end"/>
         </w:r>
       </w:hyperlink>
@@ -1495,52 +1023,10 @@
             <w:lang w:val="es-ES_tradnl"/>
           </w:rPr>
           <w:tab/>
-        </w:r>
-        <w:r>
-          <w:rPr>
-            <w:noProof/>
-            <w:webHidden/>
-            <w:lang w:val="es-ES_tradnl"/>
-          </w:rPr>
           <w:fldChar w:fldCharType="begin"/>
-        </w:r>
-        <w:r>
-          <w:rPr>
-            <w:noProof/>
-            <w:webHidden/>
-            <w:lang w:val="es-ES_tradnl"/>
-          </w:rPr>
           <w:instrText xml:space="preserve"> PAGEREF _Toc203646895 \h </w:instrText>
-        </w:r>
-        <w:r>
-          <w:rPr>
-            <w:noProof/>
-            <w:webHidden/>
-            <w:lang w:val="es-ES_tradnl"/>
-          </w:rPr>
-        </w:r>
-        <w:r>
-          <w:rPr>
-            <w:noProof/>
-            <w:webHidden/>
-            <w:lang w:val="es-ES_tradnl"/>
-          </w:rPr>
           <w:fldChar w:fldCharType="separate"/>
-        </w:r>
-        <w:r>
-          <w:rPr>
-            <w:noProof/>
-            <w:webHidden/>
-            <w:lang w:val="es-ES_tradnl"/>
-          </w:rPr>
           <w:t>8</w:t>
-        </w:r>
-        <w:r>
-          <w:rPr>
-            <w:noProof/>
-            <w:webHidden/>
-            <w:lang w:val="es-ES_tradnl"/>
-          </w:rPr>
           <w:fldChar w:fldCharType="end"/>
         </w:r>
       </w:hyperlink>
@@ -1594,52 +1080,10 @@
             <w:lang w:val="es-ES_tradnl"/>
           </w:rPr>
           <w:tab/>
-        </w:r>
-        <w:r>
-          <w:rPr>
-            <w:noProof/>
-            <w:webHidden/>
-            <w:lang w:val="es-ES_tradnl"/>
-          </w:rPr>
           <w:fldChar w:fldCharType="begin"/>
-        </w:r>
-        <w:r>
-          <w:rPr>
-            <w:noProof/>
-            <w:webHidden/>
-            <w:lang w:val="es-ES_tradnl"/>
-          </w:rPr>
           <w:instrText xml:space="preserve"> PAGEREF _Toc203646896 \h </w:instrText>
-        </w:r>
-        <w:r>
-          <w:rPr>
-            <w:noProof/>
-            <w:webHidden/>
-            <w:lang w:val="es-ES_tradnl"/>
-          </w:rPr>
-        </w:r>
-        <w:r>
-          <w:rPr>
-            <w:noProof/>
-            <w:webHidden/>
-            <w:lang w:val="es-ES_tradnl"/>
-          </w:rPr>
           <w:fldChar w:fldCharType="separate"/>
-        </w:r>
-        <w:r>
-          <w:rPr>
-            <w:noProof/>
-            <w:webHidden/>
-            <w:lang w:val="es-ES_tradnl"/>
-          </w:rPr>
           <w:t>8</w:t>
-        </w:r>
-        <w:r>
-          <w:rPr>
-            <w:noProof/>
-            <w:webHidden/>
-            <w:lang w:val="es-ES_tradnl"/>
-          </w:rPr>
           <w:fldChar w:fldCharType="end"/>
         </w:r>
       </w:hyperlink>
@@ -1693,52 +1137,10 @@
             <w:lang w:val="es-ES_tradnl"/>
           </w:rPr>
           <w:tab/>
-        </w:r>
-        <w:r>
-          <w:rPr>
-            <w:noProof/>
-            <w:webHidden/>
-            <w:lang w:val="es-ES_tradnl"/>
-          </w:rPr>
           <w:fldChar w:fldCharType="begin"/>
-        </w:r>
-        <w:r>
-          <w:rPr>
-            <w:noProof/>
-            <w:webHidden/>
-            <w:lang w:val="es-ES_tradnl"/>
-          </w:rPr>
           <w:instrText xml:space="preserve"> PAGEREF _Toc203646897 \h </w:instrText>
-        </w:r>
-        <w:r>
-          <w:rPr>
-            <w:noProof/>
-            <w:webHidden/>
-            <w:lang w:val="es-ES_tradnl"/>
-          </w:rPr>
-        </w:r>
-        <w:r>
-          <w:rPr>
-            <w:noProof/>
-            <w:webHidden/>
-            <w:lang w:val="es-ES_tradnl"/>
-          </w:rPr>
           <w:fldChar w:fldCharType="separate"/>
-        </w:r>
-        <w:r>
-          <w:rPr>
-            <w:noProof/>
-            <w:webHidden/>
-            <w:lang w:val="es-ES_tradnl"/>
-          </w:rPr>
           <w:t>8</w:t>
-        </w:r>
-        <w:r>
-          <w:rPr>
-            <w:noProof/>
-            <w:webHidden/>
-            <w:lang w:val="es-ES_tradnl"/>
-          </w:rPr>
           <w:fldChar w:fldCharType="end"/>
         </w:r>
       </w:hyperlink>
@@ -1792,52 +1194,10 @@
             <w:lang w:val="es-ES_tradnl"/>
           </w:rPr>
           <w:tab/>
-        </w:r>
-        <w:r>
-          <w:rPr>
-            <w:noProof/>
-            <w:webHidden/>
-            <w:lang w:val="es-ES_tradnl"/>
-          </w:rPr>
           <w:fldChar w:fldCharType="begin"/>
-        </w:r>
-        <w:r>
-          <w:rPr>
-            <w:noProof/>
-            <w:webHidden/>
-            <w:lang w:val="es-ES_tradnl"/>
-          </w:rPr>
           <w:instrText xml:space="preserve"> PAGEREF _Toc203646898 \h </w:instrText>
-        </w:r>
-        <w:r>
-          <w:rPr>
-            <w:noProof/>
-            <w:webHidden/>
-            <w:lang w:val="es-ES_tradnl"/>
-          </w:rPr>
-        </w:r>
-        <w:r>
-          <w:rPr>
-            <w:noProof/>
-            <w:webHidden/>
-            <w:lang w:val="es-ES_tradnl"/>
-          </w:rPr>
           <w:fldChar w:fldCharType="separate"/>
-        </w:r>
-        <w:r>
-          <w:rPr>
-            <w:noProof/>
-            <w:webHidden/>
-            <w:lang w:val="es-ES_tradnl"/>
-          </w:rPr>
           <w:t>9</w:t>
-        </w:r>
-        <w:r>
-          <w:rPr>
-            <w:noProof/>
-            <w:webHidden/>
-            <w:lang w:val="es-ES_tradnl"/>
-          </w:rPr>
           <w:fldChar w:fldCharType="end"/>
         </w:r>
       </w:hyperlink>
@@ -1891,52 +1251,10 @@
             <w:lang w:val="es-ES_tradnl"/>
           </w:rPr>
           <w:tab/>
-        </w:r>
-        <w:r>
-          <w:rPr>
-            <w:noProof/>
-            <w:webHidden/>
-            <w:lang w:val="es-ES_tradnl"/>
-          </w:rPr>
           <w:fldChar w:fldCharType="begin"/>
-        </w:r>
-        <w:r>
-          <w:rPr>
-            <w:noProof/>
-            <w:webHidden/>
-            <w:lang w:val="es-ES_tradnl"/>
-          </w:rPr>
           <w:instrText xml:space="preserve"> PAGEREF _Toc203646899 \h </w:instrText>
-        </w:r>
-        <w:r>
-          <w:rPr>
-            <w:noProof/>
-            <w:webHidden/>
-            <w:lang w:val="es-ES_tradnl"/>
-          </w:rPr>
-        </w:r>
-        <w:r>
-          <w:rPr>
-            <w:noProof/>
-            <w:webHidden/>
-            <w:lang w:val="es-ES_tradnl"/>
-          </w:rPr>
           <w:fldChar w:fldCharType="separate"/>
-        </w:r>
-        <w:r>
-          <w:rPr>
-            <w:noProof/>
-            <w:webHidden/>
-            <w:lang w:val="es-ES_tradnl"/>
-          </w:rPr>
           <w:t>10</w:t>
-        </w:r>
-        <w:r>
-          <w:rPr>
-            <w:noProof/>
-            <w:webHidden/>
-            <w:lang w:val="es-ES_tradnl"/>
-          </w:rPr>
           <w:fldChar w:fldCharType="end"/>
         </w:r>
       </w:hyperlink>
@@ -1990,52 +1308,10 @@
             <w:lang w:val="es-ES_tradnl"/>
           </w:rPr>
           <w:tab/>
-        </w:r>
-        <w:r>
-          <w:rPr>
-            <w:noProof/>
-            <w:webHidden/>
-            <w:lang w:val="es-ES_tradnl"/>
-          </w:rPr>
           <w:fldChar w:fldCharType="begin"/>
-        </w:r>
-        <w:r>
-          <w:rPr>
-            <w:noProof/>
-            <w:webHidden/>
-            <w:lang w:val="es-ES_tradnl"/>
-          </w:rPr>
           <w:instrText xml:space="preserve"> PAGEREF _Toc203646900 \h </w:instrText>
-        </w:r>
-        <w:r>
-          <w:rPr>
-            <w:noProof/>
-            <w:webHidden/>
-            <w:lang w:val="es-ES_tradnl"/>
-          </w:rPr>
-        </w:r>
-        <w:r>
-          <w:rPr>
-            <w:noProof/>
-            <w:webHidden/>
-            <w:lang w:val="es-ES_tradnl"/>
-          </w:rPr>
           <w:fldChar w:fldCharType="separate"/>
-        </w:r>
-        <w:r>
-          <w:rPr>
-            <w:noProof/>
-            <w:webHidden/>
-            <w:lang w:val="es-ES_tradnl"/>
-          </w:rPr>
           <w:t>10</w:t>
-        </w:r>
-        <w:r>
-          <w:rPr>
-            <w:noProof/>
-            <w:webHidden/>
-            <w:lang w:val="es-ES_tradnl"/>
-          </w:rPr>
           <w:fldChar w:fldCharType="end"/>
         </w:r>
       </w:hyperlink>
@@ -2089,52 +1365,10 @@
             <w:lang w:val="es-ES_tradnl"/>
           </w:rPr>
           <w:tab/>
-        </w:r>
-        <w:r>
-          <w:rPr>
-            <w:noProof/>
-            <w:webHidden/>
-            <w:lang w:val="es-ES_tradnl"/>
-          </w:rPr>
           <w:fldChar w:fldCharType="begin"/>
-        </w:r>
-        <w:r>
-          <w:rPr>
-            <w:noProof/>
-            <w:webHidden/>
-            <w:lang w:val="es-ES_tradnl"/>
-          </w:rPr>
           <w:instrText xml:space="preserve"> PAGEREF _Toc203646901 \h </w:instrText>
-        </w:r>
-        <w:r>
-          <w:rPr>
-            <w:noProof/>
-            <w:webHidden/>
-            <w:lang w:val="es-ES_tradnl"/>
-          </w:rPr>
-        </w:r>
-        <w:r>
-          <w:rPr>
-            <w:noProof/>
-            <w:webHidden/>
-            <w:lang w:val="es-ES_tradnl"/>
-          </w:rPr>
           <w:fldChar w:fldCharType="separate"/>
-        </w:r>
-        <w:r>
-          <w:rPr>
-            <w:noProof/>
-            <w:webHidden/>
-            <w:lang w:val="es-ES_tradnl"/>
-          </w:rPr>
           <w:t>11</w:t>
-        </w:r>
-        <w:r>
-          <w:rPr>
-            <w:noProof/>
-            <w:webHidden/>
-            <w:lang w:val="es-ES_tradnl"/>
-          </w:rPr>
           <w:fldChar w:fldCharType="end"/>
         </w:r>
       </w:hyperlink>
@@ -2188,52 +1422,10 @@
             <w:lang w:val="es-ES_tradnl"/>
           </w:rPr>
           <w:tab/>
-        </w:r>
-        <w:r>
-          <w:rPr>
-            <w:noProof/>
-            <w:webHidden/>
-            <w:lang w:val="es-ES_tradnl"/>
-          </w:rPr>
           <w:fldChar w:fldCharType="begin"/>
-        </w:r>
-        <w:r>
-          <w:rPr>
-            <w:noProof/>
-            <w:webHidden/>
-            <w:lang w:val="es-ES_tradnl"/>
-          </w:rPr>
           <w:instrText xml:space="preserve"> PAGEREF _Toc203646902 \h </w:instrText>
-        </w:r>
-        <w:r>
-          <w:rPr>
-            <w:noProof/>
-            <w:webHidden/>
-            <w:lang w:val="es-ES_tradnl"/>
-          </w:rPr>
-        </w:r>
-        <w:r>
-          <w:rPr>
-            <w:noProof/>
-            <w:webHidden/>
-            <w:lang w:val="es-ES_tradnl"/>
-          </w:rPr>
           <w:fldChar w:fldCharType="separate"/>
-        </w:r>
-        <w:r>
-          <w:rPr>
-            <w:noProof/>
-            <w:webHidden/>
-            <w:lang w:val="es-ES_tradnl"/>
-          </w:rPr>
           <w:t>12</w:t>
-        </w:r>
-        <w:r>
-          <w:rPr>
-            <w:noProof/>
-            <w:webHidden/>
-            <w:lang w:val="es-ES_tradnl"/>
-          </w:rPr>
           <w:fldChar w:fldCharType="end"/>
         </w:r>
       </w:hyperlink>
@@ -2287,52 +1479,10 @@
             <w:lang w:val="es-ES_tradnl"/>
           </w:rPr>
           <w:tab/>
-        </w:r>
-        <w:r>
-          <w:rPr>
-            <w:noProof/>
-            <w:webHidden/>
-            <w:lang w:val="es-ES_tradnl"/>
-          </w:rPr>
           <w:fldChar w:fldCharType="begin"/>
-        </w:r>
-        <w:r>
-          <w:rPr>
-            <w:noProof/>
-            <w:webHidden/>
-            <w:lang w:val="es-ES_tradnl"/>
-          </w:rPr>
           <w:instrText xml:space="preserve"> PAGEREF _Toc203646903 \h </w:instrText>
-        </w:r>
-        <w:r>
-          <w:rPr>
-            <w:noProof/>
-            <w:webHidden/>
-            <w:lang w:val="es-ES_tradnl"/>
-          </w:rPr>
-        </w:r>
-        <w:r>
-          <w:rPr>
-            <w:noProof/>
-            <w:webHidden/>
-            <w:lang w:val="es-ES_tradnl"/>
-          </w:rPr>
           <w:fldChar w:fldCharType="separate"/>
-        </w:r>
-        <w:r>
-          <w:rPr>
-            <w:noProof/>
-            <w:webHidden/>
-            <w:lang w:val="es-ES_tradnl"/>
-          </w:rPr>
           <w:t>12</w:t>
-        </w:r>
-        <w:r>
-          <w:rPr>
-            <w:noProof/>
-            <w:webHidden/>
-            <w:lang w:val="es-ES_tradnl"/>
-          </w:rPr>
           <w:fldChar w:fldCharType="end"/>
         </w:r>
       </w:hyperlink>
@@ -2386,52 +1536,10 @@
             <w:lang w:val="es-ES_tradnl"/>
           </w:rPr>
           <w:tab/>
-        </w:r>
-        <w:r>
-          <w:rPr>
-            <w:noProof/>
-            <w:webHidden/>
-            <w:lang w:val="es-ES_tradnl"/>
-          </w:rPr>
           <w:fldChar w:fldCharType="begin"/>
-        </w:r>
-        <w:r>
-          <w:rPr>
-            <w:noProof/>
-            <w:webHidden/>
-            <w:lang w:val="es-ES_tradnl"/>
-          </w:rPr>
           <w:instrText xml:space="preserve"> PAGEREF _Toc203646904 \h </w:instrText>
-        </w:r>
-        <w:r>
-          <w:rPr>
-            <w:noProof/>
-            <w:webHidden/>
-            <w:lang w:val="es-ES_tradnl"/>
-          </w:rPr>
-        </w:r>
-        <w:r>
-          <w:rPr>
-            <w:noProof/>
-            <w:webHidden/>
-            <w:lang w:val="es-ES_tradnl"/>
-          </w:rPr>
           <w:fldChar w:fldCharType="separate"/>
-        </w:r>
-        <w:r>
-          <w:rPr>
-            <w:noProof/>
-            <w:webHidden/>
-            <w:lang w:val="es-ES_tradnl"/>
-          </w:rPr>
           <w:t>13</w:t>
-        </w:r>
-        <w:r>
-          <w:rPr>
-            <w:noProof/>
-            <w:webHidden/>
-            <w:lang w:val="es-ES_tradnl"/>
-          </w:rPr>
           <w:fldChar w:fldCharType="end"/>
         </w:r>
       </w:hyperlink>
@@ -2485,52 +1593,10 @@
             <w:lang w:val="es-ES_tradnl"/>
           </w:rPr>
           <w:tab/>
-        </w:r>
-        <w:r>
-          <w:rPr>
-            <w:noProof/>
-            <w:webHidden/>
-            <w:lang w:val="es-ES_tradnl"/>
-          </w:rPr>
           <w:fldChar w:fldCharType="begin"/>
-        </w:r>
-        <w:r>
-          <w:rPr>
-            <w:noProof/>
-            <w:webHidden/>
-            <w:lang w:val="es-ES_tradnl"/>
-          </w:rPr>
           <w:instrText xml:space="preserve"> PAGEREF _Toc203646905 \h </w:instrText>
-        </w:r>
-        <w:r>
-          <w:rPr>
-            <w:noProof/>
-            <w:webHidden/>
-            <w:lang w:val="es-ES_tradnl"/>
-          </w:rPr>
-        </w:r>
-        <w:r>
-          <w:rPr>
-            <w:noProof/>
-            <w:webHidden/>
-            <w:lang w:val="es-ES_tradnl"/>
-          </w:rPr>
           <w:fldChar w:fldCharType="separate"/>
-        </w:r>
-        <w:r>
-          <w:rPr>
-            <w:noProof/>
-            <w:webHidden/>
-            <w:lang w:val="es-ES_tradnl"/>
-          </w:rPr>
           <w:t>13</w:t>
-        </w:r>
-        <w:r>
-          <w:rPr>
-            <w:noProof/>
-            <w:webHidden/>
-            <w:lang w:val="es-ES_tradnl"/>
-          </w:rPr>
           <w:fldChar w:fldCharType="end"/>
         </w:r>
       </w:hyperlink>
@@ -2584,52 +1650,10 @@
             <w:lang w:val="es-ES_tradnl"/>
           </w:rPr>
           <w:tab/>
-        </w:r>
-        <w:r>
-          <w:rPr>
-            <w:noProof/>
-            <w:webHidden/>
-            <w:lang w:val="es-ES_tradnl"/>
-          </w:rPr>
           <w:fldChar w:fldCharType="begin"/>
-        </w:r>
-        <w:r>
-          <w:rPr>
-            <w:noProof/>
-            <w:webHidden/>
-            <w:lang w:val="es-ES_tradnl"/>
-          </w:rPr>
           <w:instrText xml:space="preserve"> PAGEREF _Toc203646906 \h </w:instrText>
-        </w:r>
-        <w:r>
-          <w:rPr>
-            <w:noProof/>
-            <w:webHidden/>
-            <w:lang w:val="es-ES_tradnl"/>
-          </w:rPr>
-        </w:r>
-        <w:r>
-          <w:rPr>
-            <w:noProof/>
-            <w:webHidden/>
-            <w:lang w:val="es-ES_tradnl"/>
-          </w:rPr>
           <w:fldChar w:fldCharType="separate"/>
-        </w:r>
-        <w:r>
-          <w:rPr>
-            <w:noProof/>
-            <w:webHidden/>
-            <w:lang w:val="es-ES_tradnl"/>
-          </w:rPr>
           <w:t>14</w:t>
-        </w:r>
-        <w:r>
-          <w:rPr>
-            <w:noProof/>
-            <w:webHidden/>
-            <w:lang w:val="es-ES_tradnl"/>
-          </w:rPr>
           <w:fldChar w:fldCharType="end"/>
         </w:r>
       </w:hyperlink>
@@ -2683,52 +1707,10 @@
             <w:lang w:val="es-ES_tradnl"/>
           </w:rPr>
           <w:tab/>
-        </w:r>
-        <w:r>
-          <w:rPr>
-            <w:noProof/>
-            <w:webHidden/>
-            <w:lang w:val="es-ES_tradnl"/>
-          </w:rPr>
           <w:fldChar w:fldCharType="begin"/>
-        </w:r>
-        <w:r>
-          <w:rPr>
-            <w:noProof/>
-            <w:webHidden/>
-            <w:lang w:val="es-ES_tradnl"/>
-          </w:rPr>
           <w:instrText xml:space="preserve"> PAGEREF _Toc203646907 \h </w:instrText>
-        </w:r>
-        <w:r>
-          <w:rPr>
-            <w:noProof/>
-            <w:webHidden/>
-            <w:lang w:val="es-ES_tradnl"/>
-          </w:rPr>
-        </w:r>
-        <w:r>
-          <w:rPr>
-            <w:noProof/>
-            <w:webHidden/>
-            <w:lang w:val="es-ES_tradnl"/>
-          </w:rPr>
           <w:fldChar w:fldCharType="separate"/>
-        </w:r>
-        <w:r>
-          <w:rPr>
-            <w:noProof/>
-            <w:webHidden/>
-            <w:lang w:val="es-ES_tradnl"/>
-          </w:rPr>
           <w:t>14</w:t>
-        </w:r>
-        <w:r>
-          <w:rPr>
-            <w:noProof/>
-            <w:webHidden/>
-            <w:lang w:val="es-ES_tradnl"/>
-          </w:rPr>
           <w:fldChar w:fldCharType="end"/>
         </w:r>
       </w:hyperlink>
@@ -2786,52 +1768,10 @@
             <w:lang w:val="es-ES_tradnl"/>
           </w:rPr>
           <w:tab/>
-        </w:r>
-        <w:r>
-          <w:rPr>
-            <w:noProof/>
-            <w:webHidden/>
-            <w:lang w:val="es-ES_tradnl"/>
-          </w:rPr>
           <w:fldChar w:fldCharType="begin"/>
-        </w:r>
-        <w:r>
-          <w:rPr>
-            <w:noProof/>
-            <w:webHidden/>
-            <w:lang w:val="es-ES_tradnl"/>
-          </w:rPr>
           <w:instrText xml:space="preserve"> PAGEREF _Toc203646908 \h </w:instrText>
-        </w:r>
-        <w:r>
-          <w:rPr>
-            <w:noProof/>
-            <w:webHidden/>
-            <w:lang w:val="es-ES_tradnl"/>
-          </w:rPr>
-        </w:r>
-        <w:r>
-          <w:rPr>
-            <w:noProof/>
-            <w:webHidden/>
-            <w:lang w:val="es-ES_tradnl"/>
-          </w:rPr>
           <w:fldChar w:fldCharType="separate"/>
-        </w:r>
-        <w:r>
-          <w:rPr>
-            <w:noProof/>
-            <w:webHidden/>
-            <w:lang w:val="es-ES_tradnl"/>
-          </w:rPr>
           <w:t>14</w:t>
-        </w:r>
-        <w:r>
-          <w:rPr>
-            <w:noProof/>
-            <w:webHidden/>
-            <w:lang w:val="es-ES_tradnl"/>
-          </w:rPr>
           <w:fldChar w:fldCharType="end"/>
         </w:r>
       </w:hyperlink>
@@ -2885,52 +1825,10 @@
             <w:lang w:val="es-ES_tradnl"/>
           </w:rPr>
           <w:tab/>
-        </w:r>
-        <w:r>
-          <w:rPr>
-            <w:noProof/>
-            <w:webHidden/>
-            <w:lang w:val="es-ES_tradnl"/>
-          </w:rPr>
           <w:fldChar w:fldCharType="begin"/>
-        </w:r>
-        <w:r>
-          <w:rPr>
-            <w:noProof/>
-            <w:webHidden/>
-            <w:lang w:val="es-ES_tradnl"/>
-          </w:rPr>
           <w:instrText xml:space="preserve"> PAGEREF _Toc203646909 \h </w:instrText>
-        </w:r>
-        <w:r>
-          <w:rPr>
-            <w:noProof/>
-            <w:webHidden/>
-            <w:lang w:val="es-ES_tradnl"/>
-          </w:rPr>
-        </w:r>
-        <w:r>
-          <w:rPr>
-            <w:noProof/>
-            <w:webHidden/>
-            <w:lang w:val="es-ES_tradnl"/>
-          </w:rPr>
           <w:fldChar w:fldCharType="separate"/>
-        </w:r>
-        <w:r>
-          <w:rPr>
-            <w:noProof/>
-            <w:webHidden/>
-            <w:lang w:val="es-ES_tradnl"/>
-          </w:rPr>
           <w:t>15</w:t>
-        </w:r>
-        <w:r>
-          <w:rPr>
-            <w:noProof/>
-            <w:webHidden/>
-            <w:lang w:val="es-ES_tradnl"/>
-          </w:rPr>
           <w:fldChar w:fldCharType="end"/>
         </w:r>
       </w:hyperlink>
@@ -2984,52 +1882,10 @@
             <w:lang w:val="es-ES_tradnl"/>
           </w:rPr>
           <w:tab/>
-        </w:r>
-        <w:r>
-          <w:rPr>
-            <w:noProof/>
-            <w:webHidden/>
-            <w:lang w:val="es-ES_tradnl"/>
-          </w:rPr>
           <w:fldChar w:fldCharType="begin"/>
-        </w:r>
-        <w:r>
-          <w:rPr>
-            <w:noProof/>
-            <w:webHidden/>
-            <w:lang w:val="es-ES_tradnl"/>
-          </w:rPr>
           <w:instrText xml:space="preserve"> PAGEREF _Toc203646910 \h </w:instrText>
-        </w:r>
-        <w:r>
-          <w:rPr>
-            <w:noProof/>
-            <w:webHidden/>
-            <w:lang w:val="es-ES_tradnl"/>
-          </w:rPr>
-        </w:r>
-        <w:r>
-          <w:rPr>
-            <w:noProof/>
-            <w:webHidden/>
-            <w:lang w:val="es-ES_tradnl"/>
-          </w:rPr>
           <w:fldChar w:fldCharType="separate"/>
-        </w:r>
-        <w:r>
-          <w:rPr>
-            <w:noProof/>
-            <w:webHidden/>
-            <w:lang w:val="es-ES_tradnl"/>
-          </w:rPr>
           <w:t>16</w:t>
-        </w:r>
-        <w:r>
-          <w:rPr>
-            <w:noProof/>
-            <w:webHidden/>
-            <w:lang w:val="es-ES_tradnl"/>
-          </w:rPr>
           <w:fldChar w:fldCharType="end"/>
         </w:r>
       </w:hyperlink>
@@ -3083,52 +1939,10 @@
             <w:lang w:val="es-ES_tradnl"/>
           </w:rPr>
           <w:tab/>
-        </w:r>
-        <w:r>
-          <w:rPr>
-            <w:noProof/>
-            <w:webHidden/>
-            <w:lang w:val="es-ES_tradnl"/>
-          </w:rPr>
           <w:fldChar w:fldCharType="begin"/>
-        </w:r>
-        <w:r>
-          <w:rPr>
-            <w:noProof/>
-            <w:webHidden/>
-            <w:lang w:val="es-ES_tradnl"/>
-          </w:rPr>
           <w:instrText xml:space="preserve"> PAGEREF _Toc203646911 \h </w:instrText>
-        </w:r>
-        <w:r>
-          <w:rPr>
-            <w:noProof/>
-            <w:webHidden/>
-            <w:lang w:val="es-ES_tradnl"/>
-          </w:rPr>
-        </w:r>
-        <w:r>
-          <w:rPr>
-            <w:noProof/>
-            <w:webHidden/>
-            <w:lang w:val="es-ES_tradnl"/>
-          </w:rPr>
           <w:fldChar w:fldCharType="separate"/>
-        </w:r>
-        <w:r>
-          <w:rPr>
-            <w:noProof/>
-            <w:webHidden/>
-            <w:lang w:val="es-ES_tradnl"/>
-          </w:rPr>
           <w:t>16</w:t>
-        </w:r>
-        <w:r>
-          <w:rPr>
-            <w:noProof/>
-            <w:webHidden/>
-            <w:lang w:val="es-ES_tradnl"/>
-          </w:rPr>
           <w:fldChar w:fldCharType="end"/>
         </w:r>
       </w:hyperlink>
@@ -3186,52 +2000,10 @@
             <w:lang w:val="es-ES_tradnl"/>
           </w:rPr>
           <w:tab/>
-        </w:r>
-        <w:r>
-          <w:rPr>
-            <w:noProof/>
-            <w:webHidden/>
-            <w:lang w:val="es-ES_tradnl"/>
-          </w:rPr>
           <w:fldChar w:fldCharType="begin"/>
-        </w:r>
-        <w:r>
-          <w:rPr>
-            <w:noProof/>
-            <w:webHidden/>
-            <w:lang w:val="es-ES_tradnl"/>
-          </w:rPr>
           <w:instrText xml:space="preserve"> PAGEREF _Toc203646912 \h </w:instrText>
-        </w:r>
-        <w:r>
-          <w:rPr>
-            <w:noProof/>
-            <w:webHidden/>
-            <w:lang w:val="es-ES_tradnl"/>
-          </w:rPr>
-        </w:r>
-        <w:r>
-          <w:rPr>
-            <w:noProof/>
-            <w:webHidden/>
-            <w:lang w:val="es-ES_tradnl"/>
-          </w:rPr>
           <w:fldChar w:fldCharType="separate"/>
-        </w:r>
-        <w:r>
-          <w:rPr>
-            <w:noProof/>
-            <w:webHidden/>
-            <w:lang w:val="es-ES_tradnl"/>
-          </w:rPr>
           <w:t>17</w:t>
-        </w:r>
-        <w:r>
-          <w:rPr>
-            <w:noProof/>
-            <w:webHidden/>
-            <w:lang w:val="es-ES_tradnl"/>
-          </w:rPr>
           <w:fldChar w:fldCharType="end"/>
         </w:r>
       </w:hyperlink>
@@ -3289,52 +2061,10 @@
             <w:lang w:val="es-ES_tradnl"/>
           </w:rPr>
           <w:tab/>
-        </w:r>
-        <w:r>
-          <w:rPr>
-            <w:noProof/>
-            <w:webHidden/>
-            <w:lang w:val="es-ES_tradnl"/>
-          </w:rPr>
           <w:fldChar w:fldCharType="begin"/>
-        </w:r>
-        <w:r>
-          <w:rPr>
-            <w:noProof/>
-            <w:webHidden/>
-            <w:lang w:val="es-ES_tradnl"/>
-          </w:rPr>
           <w:instrText xml:space="preserve"> PAGEREF _Toc203646913 \h </w:instrText>
-        </w:r>
-        <w:r>
-          <w:rPr>
-            <w:noProof/>
-            <w:webHidden/>
-            <w:lang w:val="es-ES_tradnl"/>
-          </w:rPr>
-        </w:r>
-        <w:r>
-          <w:rPr>
-            <w:noProof/>
-            <w:webHidden/>
-            <w:lang w:val="es-ES_tradnl"/>
-          </w:rPr>
           <w:fldChar w:fldCharType="separate"/>
-        </w:r>
-        <w:r>
-          <w:rPr>
-            <w:noProof/>
-            <w:webHidden/>
-            <w:lang w:val="es-ES_tradnl"/>
-          </w:rPr>
           <w:t>18</w:t>
-        </w:r>
-        <w:r>
-          <w:rPr>
-            <w:noProof/>
-            <w:webHidden/>
-            <w:lang w:val="es-ES_tradnl"/>
-          </w:rPr>
           <w:fldChar w:fldCharType="end"/>
         </w:r>
       </w:hyperlink>
@@ -3392,52 +2122,10 @@
             <w:lang w:val="es-ES_tradnl"/>
           </w:rPr>
           <w:tab/>
-        </w:r>
-        <w:r>
-          <w:rPr>
-            <w:noProof/>
-            <w:webHidden/>
-            <w:lang w:val="es-ES_tradnl"/>
-          </w:rPr>
           <w:fldChar w:fldCharType="begin"/>
-        </w:r>
-        <w:r>
-          <w:rPr>
-            <w:noProof/>
-            <w:webHidden/>
-            <w:lang w:val="es-ES_tradnl"/>
-          </w:rPr>
           <w:instrText xml:space="preserve"> PAGEREF _Toc203646914 \h </w:instrText>
-        </w:r>
-        <w:r>
-          <w:rPr>
-            <w:noProof/>
-            <w:webHidden/>
-            <w:lang w:val="es-ES_tradnl"/>
-          </w:rPr>
-        </w:r>
-        <w:r>
-          <w:rPr>
-            <w:noProof/>
-            <w:webHidden/>
-            <w:lang w:val="es-ES_tradnl"/>
-          </w:rPr>
           <w:fldChar w:fldCharType="separate"/>
-        </w:r>
-        <w:r>
-          <w:rPr>
-            <w:noProof/>
-            <w:webHidden/>
-            <w:lang w:val="es-ES_tradnl"/>
-          </w:rPr>
           <w:t>19</w:t>
-        </w:r>
-        <w:r>
-          <w:rPr>
-            <w:noProof/>
-            <w:webHidden/>
-            <w:lang w:val="es-ES_tradnl"/>
-          </w:rPr>
           <w:fldChar w:fldCharType="end"/>
         </w:r>
       </w:hyperlink>
@@ -3491,52 +2179,10 @@
             <w:lang w:val="es-ES_tradnl"/>
           </w:rPr>
           <w:tab/>
-        </w:r>
-        <w:r>
-          <w:rPr>
-            <w:noProof/>
-            <w:webHidden/>
-            <w:lang w:val="es-ES_tradnl"/>
-          </w:rPr>
           <w:fldChar w:fldCharType="begin"/>
-        </w:r>
-        <w:r>
-          <w:rPr>
-            <w:noProof/>
-            <w:webHidden/>
-            <w:lang w:val="es-ES_tradnl"/>
-          </w:rPr>
           <w:instrText xml:space="preserve"> PAGEREF _Toc203646915 \h </w:instrText>
-        </w:r>
-        <w:r>
-          <w:rPr>
-            <w:noProof/>
-            <w:webHidden/>
-            <w:lang w:val="es-ES_tradnl"/>
-          </w:rPr>
-        </w:r>
-        <w:r>
-          <w:rPr>
-            <w:noProof/>
-            <w:webHidden/>
-            <w:lang w:val="es-ES_tradnl"/>
-          </w:rPr>
           <w:fldChar w:fldCharType="separate"/>
-        </w:r>
-        <w:r>
-          <w:rPr>
-            <w:noProof/>
-            <w:webHidden/>
-            <w:lang w:val="es-ES_tradnl"/>
-          </w:rPr>
           <w:t>20</w:t>
-        </w:r>
-        <w:r>
-          <w:rPr>
-            <w:noProof/>
-            <w:webHidden/>
-            <w:lang w:val="es-ES_tradnl"/>
-          </w:rPr>
           <w:fldChar w:fldCharType="end"/>
         </w:r>
       </w:hyperlink>
@@ -3590,52 +2236,10 @@
             <w:lang w:val="es-ES_tradnl"/>
           </w:rPr>
           <w:tab/>
-        </w:r>
-        <w:r>
-          <w:rPr>
-            <w:noProof/>
-            <w:webHidden/>
-            <w:lang w:val="es-ES_tradnl"/>
-          </w:rPr>
           <w:fldChar w:fldCharType="begin"/>
-        </w:r>
-        <w:r>
-          <w:rPr>
-            <w:noProof/>
-            <w:webHidden/>
-            <w:lang w:val="es-ES_tradnl"/>
-          </w:rPr>
           <w:instrText xml:space="preserve"> PAGEREF _Toc203646916 \h </w:instrText>
-        </w:r>
-        <w:r>
-          <w:rPr>
-            <w:noProof/>
-            <w:webHidden/>
-            <w:lang w:val="es-ES_tradnl"/>
-          </w:rPr>
-        </w:r>
-        <w:r>
-          <w:rPr>
-            <w:noProof/>
-            <w:webHidden/>
-            <w:lang w:val="es-ES_tradnl"/>
-          </w:rPr>
           <w:fldChar w:fldCharType="separate"/>
-        </w:r>
-        <w:r>
-          <w:rPr>
-            <w:noProof/>
-            <w:webHidden/>
-            <w:lang w:val="es-ES_tradnl"/>
-          </w:rPr>
           <w:t>21</w:t>
-        </w:r>
-        <w:r>
-          <w:rPr>
-            <w:noProof/>
-            <w:webHidden/>
-            <w:lang w:val="es-ES_tradnl"/>
-          </w:rPr>
           <w:fldChar w:fldCharType="end"/>
         </w:r>
       </w:hyperlink>
@@ -3689,52 +2293,10 @@
             <w:lang w:val="es-ES_tradnl"/>
           </w:rPr>
           <w:tab/>
-        </w:r>
-        <w:r>
-          <w:rPr>
-            <w:noProof/>
-            <w:webHidden/>
-            <w:lang w:val="es-ES_tradnl"/>
-          </w:rPr>
           <w:fldChar w:fldCharType="begin"/>
-        </w:r>
-        <w:r>
-          <w:rPr>
-            <w:noProof/>
-            <w:webHidden/>
-            <w:lang w:val="es-ES_tradnl"/>
-          </w:rPr>
           <w:instrText xml:space="preserve"> PAGEREF _Toc203646917 \h </w:instrText>
-        </w:r>
-        <w:r>
-          <w:rPr>
-            <w:noProof/>
-            <w:webHidden/>
-            <w:lang w:val="es-ES_tradnl"/>
-          </w:rPr>
-        </w:r>
-        <w:r>
-          <w:rPr>
-            <w:noProof/>
-            <w:webHidden/>
-            <w:lang w:val="es-ES_tradnl"/>
-          </w:rPr>
           <w:fldChar w:fldCharType="separate"/>
-        </w:r>
-        <w:r>
-          <w:rPr>
-            <w:noProof/>
-            <w:webHidden/>
-            <w:lang w:val="es-ES_tradnl"/>
-          </w:rPr>
           <w:t>22</w:t>
-        </w:r>
-        <w:r>
-          <w:rPr>
-            <w:noProof/>
-            <w:webHidden/>
-            <w:lang w:val="es-ES_tradnl"/>
-          </w:rPr>
           <w:fldChar w:fldCharType="end"/>
         </w:r>
       </w:hyperlink>
@@ -3788,52 +2350,10 @@
             <w:lang w:val="es-ES_tradnl"/>
           </w:rPr>
           <w:tab/>
-        </w:r>
-        <w:r>
-          <w:rPr>
-            <w:noProof/>
-            <w:webHidden/>
-            <w:lang w:val="es-ES_tradnl"/>
-          </w:rPr>
           <w:fldChar w:fldCharType="begin"/>
-        </w:r>
-        <w:r>
-          <w:rPr>
-            <w:noProof/>
-            <w:webHidden/>
-            <w:lang w:val="es-ES_tradnl"/>
-          </w:rPr>
           <w:instrText xml:space="preserve"> PAGEREF _Toc203646918 \h </w:instrText>
-        </w:r>
-        <w:r>
-          <w:rPr>
-            <w:noProof/>
-            <w:webHidden/>
-            <w:lang w:val="es-ES_tradnl"/>
-          </w:rPr>
-        </w:r>
-        <w:r>
-          <w:rPr>
-            <w:noProof/>
-            <w:webHidden/>
-            <w:lang w:val="es-ES_tradnl"/>
-          </w:rPr>
           <w:fldChar w:fldCharType="separate"/>
-        </w:r>
-        <w:r>
-          <w:rPr>
-            <w:noProof/>
-            <w:webHidden/>
-            <w:lang w:val="es-ES_tradnl"/>
-          </w:rPr>
           <w:t>22</w:t>
-        </w:r>
-        <w:r>
-          <w:rPr>
-            <w:noProof/>
-            <w:webHidden/>
-            <w:lang w:val="es-ES_tradnl"/>
-          </w:rPr>
           <w:fldChar w:fldCharType="end"/>
         </w:r>
       </w:hyperlink>
@@ -3883,21 +2403,7 @@
           <w:rFonts w:cs="Segoe UI"/>
           <w:lang w:val="es-ES_tradnl"/>
         </w:rPr>
-        <w:t xml:space="preserve">El presente documento establece las obligaciones y recomendaciones de seguridad de la información, protección de datos personales y uso de los medios informáticos de </w:t>
-      </w:r>
-      <w:r>
-        <w:rPr>
-          <w:rFonts w:cs="Segoe UI"/>
-          <w:lang w:val="es-ES_tradnl"/>
-        </w:rPr>
-        <w:t>OPTIM TECH</w:t>
-      </w:r>
-      <w:r>
-        <w:rPr>
-          <w:rFonts w:cs="Segoe UI"/>
-          <w:lang w:val="es-ES_tradnl"/>
-        </w:rPr>
-        <w:t>.</w:t>
+        <w:t>El presente documento establece las obligaciones y recomendaciones de seguridad de la información, protección de datos personales y uso de los medios informáticos de OPTIM TECH.</w:t>
       </w:r>
     </w:p>
     <w:p>
@@ -3929,35 +2435,7 @@
           <w:rFonts w:cs="Segoe UI"/>
           <w:lang w:val="es-ES_tradnl"/>
         </w:rPr>
-        <w:t xml:space="preserve">Esta normativa es de obligado cumplimiento por parte de todas las personas trabajadoras de </w:t>
-      </w:r>
-      <w:r>
-        <w:rPr>
-          <w:rFonts w:cs="Segoe UI"/>
-          <w:lang w:val="es-ES_tradnl"/>
-        </w:rPr>
-        <w:t>OPTIM TECH</w:t>
-      </w:r>
-      <w:r>
-        <w:rPr>
-          <w:rFonts w:cs="Segoe UI"/>
-          <w:lang w:val="es-ES_tradnl"/>
-        </w:rPr>
-        <w:t xml:space="preserve"> (el personal), incluyendo el personal propio de la empresa, así como la personas que colaboran con </w:t>
-      </w:r>
-      <w:r>
-        <w:rPr>
-          <w:rFonts w:cs="Segoe UI"/>
-          <w:lang w:val="es-ES_tradnl"/>
-        </w:rPr>
-        <w:t>OPTIM TECH</w:t>
-      </w:r>
-      <w:r>
-        <w:rPr>
-          <w:rFonts w:cs="Segoe UI"/>
-          <w:lang w:val="es-ES_tradnl"/>
-        </w:rPr>
-        <w:t xml:space="preserve"> y tienen acceso a la información de la empresa y/o utilizan sus medios informáticos</w:t>
+        <w:t>Esta normativa es de obligado cumplimiento por parte de todas las personas trabajadoras de OPTIM TECH (el personal), incluyendo el personal propio de la empresa, así como la personas que colaboran con OPTIM TECH y tienen acceso a la información de la empresa y/o utilizan sus medios informáticos</w:t>
       </w:r>
       <w:r>
         <w:rPr>
@@ -4038,13 +2516,7 @@
         <w:rPr>
           <w:lang w:val="es-ES_tradnl"/>
         </w:rPr>
-        <w:t>D01</w:t>
-      </w:r>
-      <w:r>
-        <w:rPr>
-          <w:lang w:val="es-ES_tradnl"/>
-        </w:rPr>
-        <w:t xml:space="preserve"> – Política de Seguridad de la Información</w:t>
+        <w:t>D01 – Política de Seguridad de la Información</w:t>
       </w:r>
     </w:p>
     <w:p>
@@ -4090,21 +2562,7 @@
           <w:rFonts w:cs="Segoe UI"/>
           <w:lang w:val="es-ES_tradnl"/>
         </w:rPr>
-        <w:t xml:space="preserve">La personas trabajadoras y colaboradores de </w:t>
-      </w:r>
-      <w:r>
-        <w:rPr>
-          <w:rFonts w:cs="Segoe UI"/>
-          <w:lang w:val="es-ES_tradnl"/>
-        </w:rPr>
-        <w:t>OPTIM TECH</w:t>
-      </w:r>
-      <w:r>
-        <w:rPr>
-          <w:rFonts w:cs="Segoe UI"/>
-          <w:lang w:val="es-ES_tradnl"/>
-        </w:rPr>
-        <w:t xml:space="preserve"> se comprometen a:</w:t>
+        <w:t>La personas trabajadoras y colaboradores de OPTIM TECH se comprometen a:</w:t>
       </w:r>
     </w:p>
     <w:p>
@@ -4125,21 +2583,7 @@
           <w:rFonts w:cs="Segoe UI"/>
           <w:lang w:val="es-ES"/>
         </w:rPr>
-        <w:t xml:space="preserve">Guardar secreto y garantizar la confidencialidad y seguridad respecto de los datos e información a los que pudiera tener acceso por razones de su responsabilidad laboral, contractual o de cualquier otro tipo. No podrá hacer uso de la información confidencial a que tenga acceso para fines distintos a los que haya determinado </w:t>
-      </w:r>
-      <w:r>
-        <w:rPr>
-          <w:rFonts w:cs="Segoe UI"/>
-          <w:lang w:val="es-ES"/>
-        </w:rPr>
-        <w:t>OPTIM TECH</w:t>
-      </w:r>
-      <w:r>
-        <w:rPr>
-          <w:rFonts w:cs="Segoe UI"/>
-          <w:lang w:val="es-ES"/>
-        </w:rPr>
-        <w:t>, quedando expresamente prohibida la comunicación o transferencia de información confidencial a terceros no autorizados.</w:t>
+        <w:t>Guardar secreto y garantizar la confidencialidad y seguridad respecto de los datos e información a los que pudiera tener acceso por razones de su responsabilidad laboral, contractual o de cualquier otro tipo. No podrá hacer uso de la información confidencial a que tenga acceso para fines distintos a los que haya determinado OPTIM TECH, quedando expresamente prohibida la comunicación o transferencia de información confidencial a terceros no autorizados.</w:t>
       </w:r>
     </w:p>
     <w:p>
@@ -4160,35 +2604,7 @@
           <w:rFonts w:cs="Segoe UI"/>
           <w:lang w:val="es-ES_tradnl"/>
         </w:rPr>
-        <w:t xml:space="preserve">Entre otras, y sin propósito de exclusividad, debe entenderse como Información Confidencial cualquier información de </w:t>
-      </w:r>
-      <w:r>
-        <w:rPr>
-          <w:rFonts w:cs="Segoe UI"/>
-          <w:lang w:val="es-ES_tradnl"/>
-        </w:rPr>
-        <w:t>OPTIM TECH</w:t>
-      </w:r>
-      <w:r>
-        <w:rPr>
-          <w:rFonts w:cs="Segoe UI"/>
-          <w:lang w:val="es-ES_tradnl"/>
-        </w:rPr>
-        <w:t xml:space="preserve"> en relación a su negocio, tecnología e información propia y/o de terceras partes, incluyendo, a título enunciativo, informes y planes de negocio, secretos comerciales, información técnica, ideas de productos, contratos, información financiera, estructura de precios, descuentos, programas de ordenador, código fuente, derechos de propiedad intelectual e industrial, invenciones, clientes y potenciales clientes, alianzas estratégicas, socios y colaboradores, aquella que contiene datos personales y toda aquella información que </w:t>
-      </w:r>
-      <w:r>
-        <w:rPr>
-          <w:rFonts w:cs="Segoe UI"/>
-          <w:lang w:val="es-ES_tradnl"/>
-        </w:rPr>
-        <w:t>OPTIM TECH</w:t>
-      </w:r>
-      <w:r>
-        <w:rPr>
-          <w:rFonts w:cs="Segoe UI"/>
-          <w:lang w:val="es-ES_tradnl"/>
-        </w:rPr>
-        <w:t xml:space="preserve"> no haya autorizado de modo explícito para su libre uso o difusión.</w:t>
+        <w:t>Entre otras, y sin propósito de exclusividad, debe entenderse como Información Confidencial cualquier información de OPTIM TECH en relación a su negocio, tecnología e información propia y/o de terceras partes, incluyendo, a título enunciativo, informes y planes de negocio, secretos comerciales, información técnica, ideas de productos, contratos, información financiera, estructura de precios, descuentos, programas de ordenador, código fuente, derechos de propiedad intelectual e industrial, invenciones, clientes y potenciales clientes, alianzas estratégicas, socios y colaboradores, aquella que contiene datos personales y toda aquella información que OPTIM TECH no haya autorizado de modo explícito para su libre uso o difusión.</w:t>
       </w:r>
     </w:p>
     <w:p>
@@ -4209,35 +2625,7 @@
           <w:rFonts w:cs="Segoe UI"/>
           <w:lang w:val="es-ES"/>
         </w:rPr>
-        <w:t xml:space="preserve">Se hace constar expresamente el carácter de confidencial de la información que pudiera llegar a su conocimiento a través del acceso a los sistemas informáticos de </w:t>
-      </w:r>
-      <w:r>
-        <w:rPr>
-          <w:rFonts w:cs="Segoe UI"/>
-          <w:lang w:val="es-ES"/>
-        </w:rPr>
-        <w:t>OPTIM TECH</w:t>
-      </w:r>
-      <w:r>
-        <w:rPr>
-          <w:rFonts w:cs="Segoe UI"/>
-          <w:lang w:val="es-ES"/>
-        </w:rPr>
-        <w:t xml:space="preserve"> y el listado de clientes de </w:t>
-      </w:r>
-      <w:r>
-        <w:rPr>
-          <w:rFonts w:cs="Segoe UI"/>
-          <w:lang w:val="es-ES"/>
-        </w:rPr>
-        <w:t>OPTIM TECH</w:t>
-      </w:r>
-      <w:r>
-        <w:rPr>
-          <w:rFonts w:cs="Segoe UI"/>
-          <w:lang w:val="es-ES"/>
-        </w:rPr>
-        <w:t xml:space="preserve"> con sus datos de contacto.</w:t>
+        <w:t>Se hace constar expresamente el carácter de confidencial de la información que pudiera llegar a su conocimiento a través del acceso a los sistemas informáticos de OPTIM TECH y el listado de clientes de OPTIM TECH con sus datos de contacto.</w:t>
       </w:r>
     </w:p>
     <w:p>
@@ -4280,35 +2668,7 @@
           <w:rFonts w:cs="Segoe UI"/>
           <w:lang w:val="es-ES"/>
         </w:rPr>
-        <w:t xml:space="preserve">Este deber de secreto y confidencialidad en el uso de la información será observado durante la vigencia de esta relación laboral o contractual y también se mantendrá en vigor con posterioridad a la extinción de la relación laboral o contractual con </w:t>
-      </w:r>
-      <w:r>
-        <w:rPr>
-          <w:rFonts w:cs="Segoe UI"/>
-          <w:lang w:val="es-ES"/>
-        </w:rPr>
-        <w:t>OPTIM TECH</w:t>
-      </w:r>
-      <w:r>
-        <w:rPr>
-          <w:rFonts w:cs="Segoe UI"/>
-          <w:lang w:val="es-ES"/>
-        </w:rPr>
-        <w:t xml:space="preserve"> durante un periodo mínimo de </w:t>
-      </w:r>
-      <w:r>
-        <w:rPr>
-          <w:rFonts w:cs="Segoe UI"/>
-          <w:lang w:val="es-ES"/>
-        </w:rPr>
-        <w:t>2 años</w:t>
-      </w:r>
-      <w:r>
-        <w:rPr>
-          <w:rFonts w:cs="Segoe UI"/>
-          <w:lang w:val="es-ES"/>
-        </w:rPr>
-        <w:t xml:space="preserve"> y siempre que su divulgación o suso indebido pueda causar un perjuicio a la empresa.</w:t>
+        <w:t>Este deber de secreto y confidencialidad en el uso de la información será observado durante la vigencia de esta relación laboral o contractual y también se mantendrá en vigor con posterioridad a la extinción de la relación laboral o contractual con OPTIM TECH durante un periodo mínimo de 2 años y siempre que su divulgación o suso indebido pueda causar un perjuicio a la empresa.</w:t>
       </w:r>
     </w:p>
     <w:p>
@@ -4330,49 +2690,7 @@
           <w:rFonts w:cs="Segoe UI"/>
           <w:lang w:val="es-ES_tradnl"/>
         </w:rPr>
-        <w:t xml:space="preserve">Una vez finalizada la relación laboral o contractual con </w:t>
-      </w:r>
-      <w:r>
-        <w:rPr>
-          <w:rFonts w:cs="Segoe UI"/>
-          <w:lang w:val="es-ES_tradnl"/>
-        </w:rPr>
-        <w:t>OPTIM TECH</w:t>
-      </w:r>
-      <w:r>
-        <w:rPr>
-          <w:rFonts w:cs="Segoe UI"/>
-          <w:lang w:val="es-ES_tradnl"/>
-        </w:rPr>
-        <w:t xml:space="preserve">, no se permite conservar sin autorización ninguna copia de cualquier material, información, dato personal o documentación derivada de las tareas objeto de su actividad en </w:t>
-      </w:r>
-      <w:r>
-        <w:rPr>
-          <w:rFonts w:cs="Segoe UI"/>
-          <w:lang w:val="es-ES_tradnl"/>
-        </w:rPr>
-        <w:t>OPTIM TECH</w:t>
-      </w:r>
-      <w:r>
-        <w:rPr>
-          <w:rFonts w:cs="Segoe UI"/>
-          <w:lang w:val="es-ES_tradnl"/>
-        </w:rPr>
-        <w:t xml:space="preserve"> y que tenga carácter confidencial o que cuya propiedad intelectual sea de </w:t>
-      </w:r>
-      <w:r>
-        <w:rPr>
-          <w:rFonts w:cs="Segoe UI"/>
-          <w:lang w:val="es-ES_tradnl"/>
-        </w:rPr>
-        <w:t>OPTIM TECH</w:t>
-      </w:r>
-      <w:r>
-        <w:rPr>
-          <w:rFonts w:cs="Segoe UI"/>
-          <w:lang w:val="es-ES_tradnl"/>
-        </w:rPr>
-        <w:t>.</w:t>
+        <w:t>Una vez finalizada la relación laboral o contractual con OPTIM TECH, no se permite conservar sin autorización ninguna copia de cualquier material, información, dato personal o documentación derivada de las tareas objeto de su actividad en OPTIM TECH y que tenga carácter confidencial o que cuya propiedad intelectual sea de OPTIM TECH.</w:t>
       </w:r>
       <w:bookmarkEnd w:id="11"/>
     </w:p>
@@ -4394,21 +2712,7 @@
           <w:rFonts w:cs="Segoe UI"/>
           <w:lang w:val="es-ES"/>
         </w:rPr>
-        <w:t xml:space="preserve">Cabe señalar que de acuerdo con los artículos 197 y 279 del Código Penal cualquier acceso, revelación, divulgación, cesión, modificación de información confidencial de la </w:t>
-      </w:r>
-      <w:r>
-        <w:rPr>
-          <w:rFonts w:cs="Segoe UI"/>
-          <w:lang w:val="es-ES"/>
-        </w:rPr>
-        <w:t>OPTIM TECH</w:t>
-      </w:r>
-      <w:r>
-        <w:rPr>
-          <w:rFonts w:cs="Segoe UI"/>
-          <w:lang w:val="es-ES"/>
-        </w:rPr>
-        <w:t>, así como facilitar su acceso por parte de terceros, es susceptible de constituir una infracción de carácter penal.</w:t>
+        <w:t>Cabe señalar que de acuerdo con los artículos 197 y 279 del Código Penal cualquier acceso, revelación, divulgación, cesión, modificación de información confidencial de la OPTIM TECH, así como facilitar su acceso por parte de terceros, es susceptible de constituir una infracción de carácter penal.</w:t>
       </w:r>
     </w:p>
     <w:p>
@@ -4439,19 +2743,7 @@
         <w:rPr>
           <w:lang w:val="es-ES"/>
         </w:rPr>
-        <w:t xml:space="preserve">Toda información y documentación que sea propiedad o sea tratada por </w:t>
-      </w:r>
-      <w:r>
-        <w:rPr>
-          <w:lang w:val="es-ES"/>
-        </w:rPr>
-        <w:t>OPTIM TECH</w:t>
-      </w:r>
-      <w:r>
-        <w:rPr>
-          <w:lang w:val="es-ES"/>
-        </w:rPr>
-        <w:t xml:space="preserve"> debe ser clasificada de acuerdo con criterios de confidencialidad con el fin de minimizar los riesgos de fuga o divulgación indebida de la información de acuerdo con lo que se establece en la </w:t>
+        <w:t xml:space="preserve">Toda información y documentación que sea propiedad o sea tratada por OPTIM TECH debe ser clasificada de acuerdo con criterios de confidencialidad con el fin de minimizar los riesgos de fuga o divulgación indebida de la información de acuerdo con lo que se establece en la </w:t>
       </w:r>
       <w:r>
         <w:rPr>
@@ -4611,19 +2903,7 @@
               <w:rPr>
                 <w:lang w:val="es-ES_tradnl"/>
               </w:rPr>
-              <w:t xml:space="preserve">Información que no requiere de protección en su divulgación, o porque su divulgación intencionada o accidental no supone ningún tipo de riesgo para </w:t>
-            </w:r>
-            <w:r>
-              <w:rPr>
-                <w:lang w:val="es-ES_tradnl"/>
-              </w:rPr>
-              <w:t>OPTIM TECH</w:t>
-            </w:r>
-            <w:r>
-              <w:rPr>
-                <w:lang w:val="es-ES_tradnl"/>
-              </w:rPr>
-              <w:t>.</w:t>
+              <w:t>Información que no requiere de protección en su divulgación, o porque su divulgación intencionada o accidental no supone ningún tipo de riesgo para OPTIM TECH.</w:t>
             </w:r>
           </w:p>
           <w:p>
@@ -4655,19 +2935,7 @@
               <w:rPr>
                 <w:lang w:val="es-ES_tradnl"/>
               </w:rPr>
-              <w:t xml:space="preserve">Se trata de información accesible y divulgable por parte de cualquier persona, incluyendo aquellas que sean ajenas a </w:t>
-            </w:r>
-            <w:r>
-              <w:rPr>
-                <w:lang w:val="es-ES_tradnl"/>
-              </w:rPr>
-              <w:t>OPTIM TECH</w:t>
-            </w:r>
-            <w:r>
-              <w:rPr>
-                <w:lang w:val="es-ES_tradnl"/>
-              </w:rPr>
-              <w:t>.</w:t>
+              <w:t>Se trata de información accesible y divulgable por parte de cualquier persona, incluyendo aquellas que sean ajenas a OPTIM TECH.</w:t>
             </w:r>
           </w:p>
         </w:tc>
@@ -4759,19 +3027,7 @@
               <w:rPr>
                 <w:lang w:val="es-ES_tradnl"/>
               </w:rPr>
-              <w:t xml:space="preserve">Será accesible para todo el personal interno y aquellos colaboradores externos previamente autorizados por </w:t>
-            </w:r>
-            <w:r>
-              <w:rPr>
-                <w:lang w:val="es-ES_tradnl"/>
-              </w:rPr>
-              <w:t>OPTIM TECH</w:t>
-            </w:r>
-            <w:r>
-              <w:rPr>
-                <w:lang w:val="es-ES_tradnl"/>
-              </w:rPr>
-              <w:t xml:space="preserve"> y que hayan firmado acuerdos de confidencialidad. </w:t>
+              <w:t xml:space="preserve">Será accesible para todo el personal interno y aquellos colaboradores externos previamente autorizados por OPTIM TECH y que hayan firmado acuerdos de confidencialidad. </w:t>
             </w:r>
           </w:p>
           <w:p>
@@ -4951,19 +3207,7 @@
               <w:rPr>
                 <w:lang w:val="es-ES_tradnl"/>
               </w:rPr>
-              <w:t xml:space="preserve">Información cuya divulgación, alteración o pérdida puede suponer un quebranto económico grave para </w:t>
-            </w:r>
-            <w:r>
-              <w:rPr>
-                <w:lang w:val="es-ES_tradnl"/>
-              </w:rPr>
-              <w:t>OPTIM TECH</w:t>
-            </w:r>
-            <w:r>
-              <w:rPr>
-                <w:lang w:val="es-ES_tradnl"/>
-              </w:rPr>
-              <w:t>, un deterioro significativo de su imagen pública, atentar directamente con el derecho a la intimidad de las personas, afectar significativamente a su posición en el mercado o incumplir la normativa vigente.</w:t>
+              <w:t>Información cuya divulgación, alteración o pérdida puede suponer un quebranto económico grave para OPTIM TECH, un deterioro significativo de su imagen pública, atentar directamente con el derecho a la intimidad de las personas, afectar significativamente a su posición en el mercado o incumplir la normativa vigente.</w:t>
             </w:r>
           </w:p>
           <w:p>
@@ -5032,19 +3276,7 @@
         <w:rPr>
           <w:lang w:val="es-ES"/>
         </w:rPr>
-        <w:t xml:space="preserve">La responsabilidad del proceso de clasificación de cada uno de los activos de información de </w:t>
-      </w:r>
-      <w:r>
-        <w:rPr>
-          <w:lang w:val="es-ES"/>
-        </w:rPr>
-        <w:t>OPTIM TECH</w:t>
-      </w:r>
-      <w:r>
-        <w:rPr>
-          <w:lang w:val="es-ES"/>
-        </w:rPr>
-        <w:t xml:space="preserve"> recae sobre el propietario de la información y documentación a clasificar, debiendo tenerse en cuenta que se aplicará el criterio más restrictivo posible, y que deberá ejecutar este proceso periódicamente con la finalidad de asegurar la vigencia de la citada clasificación. Asimismo, el propietario será responsable de asegurar que las medidas de seguridad implantadas son acordes con dicha clasificación.</w:t>
+        <w:t>La responsabilidad del proceso de clasificación de cada uno de los activos de información de OPTIM TECH recae sobre el propietario de la información y documentación a clasificar, debiendo tenerse en cuenta que se aplicará el criterio más restrictivo posible, y que deberá ejecutar este proceso periódicamente con la finalidad de asegurar la vigencia de la citada clasificación. Asimismo, el propietario será responsable de asegurar que las medidas de seguridad implantadas son acordes con dicha clasificación.</w:t>
       </w:r>
     </w:p>
     <w:p>
@@ -5110,19 +3342,7 @@
         <w:rPr>
           <w:lang w:val="es-ES"/>
         </w:rPr>
-        <w:t xml:space="preserve">Todos los documentos generados por </w:t>
-      </w:r>
-      <w:r>
-        <w:rPr>
-          <w:lang w:val="es-ES"/>
-        </w:rPr>
-        <w:t>OPTIM TECH</w:t>
-      </w:r>
-      <w:r>
-        <w:rPr>
-          <w:lang w:val="es-ES"/>
-        </w:rPr>
-        <w:t xml:space="preserve"> deben contener la información de su clasificación siempre que sea posible, indicando de forma visible el nivel de clasificación en su cabecera y en todas sus páginas.</w:t>
+        <w:t>Todos los documentos generados por OPTIM TECH deben contener la información de su clasificación siempre que sea posible, indicando de forma visible el nivel de clasificación en su cabecera y en todas sus páginas.</w:t>
       </w:r>
     </w:p>
     <w:p>
@@ -5140,19 +3360,7 @@
         <w:rPr>
           <w:lang w:val="es-ES_tradnl"/>
         </w:rPr>
-        <w:t xml:space="preserve">En el caso de un documento generado por </w:t>
-      </w:r>
-      <w:r>
-        <w:rPr>
-          <w:lang w:val="es-ES_tradnl"/>
-        </w:rPr>
-        <w:t>OPTIM TECH</w:t>
-      </w:r>
-      <w:r>
-        <w:rPr>
-          <w:lang w:val="es-ES_tradnl"/>
-        </w:rPr>
-        <w:t xml:space="preserve"> que no incluya información de clasificación, será tratado como “Uso interno”.</w:t>
+        <w:t>En el caso de un documento generado por OPTIM TECH que no incluya información de clasificación, será tratado como “Uso interno”.</w:t>
       </w:r>
     </w:p>
     <w:p>
@@ -5170,19 +3378,7 @@
         <w:rPr>
           <w:lang w:val="es-ES_tradnl"/>
         </w:rPr>
-        <w:t xml:space="preserve">En el caso de documentos externos no generados por </w:t>
-      </w:r>
-      <w:r>
-        <w:rPr>
-          <w:lang w:val="es-ES_tradnl"/>
-        </w:rPr>
-        <w:t>OPTIM TECH</w:t>
-      </w:r>
-      <w:r>
-        <w:rPr>
-          <w:lang w:val="es-ES_tradnl"/>
-        </w:rPr>
-        <w:t xml:space="preserve"> y que, por tanto, no incluyen esta información de clasificación, serán tratados como información “Reservada”.</w:t>
+        <w:t>En el caso de documentos externos no generados por OPTIM TECH y que, por tanto, no incluyen esta información de clasificación, serán tratados como información “Reservada”.</w:t>
       </w:r>
     </w:p>
     <w:p>
@@ -5214,19 +3410,7 @@
         <w:rPr>
           <w:lang w:val="es-ES"/>
         </w:rPr>
-        <w:t xml:space="preserve">Así, por ejemplo, si un documento está contenido en una carpeta que tiene el acceso permitido a todo el personal de </w:t>
-      </w:r>
-      <w:r>
-        <w:rPr>
-          <w:lang w:val="es-ES"/>
-        </w:rPr>
-        <w:t>OPTIM TECH</w:t>
-      </w:r>
-      <w:r>
-        <w:rPr>
-          <w:lang w:val="es-ES"/>
-        </w:rPr>
-        <w:t>, se considerará como “Uso Interno”. Si por lo contrario el acceso está restringido a únicamente el personal de un área, departamento o proyecto será considerada “Reservada”. Si el acceso a esta carpeta o documento está restringido a personas concretas, será considerado como “Secreto”.</w:t>
+        <w:t>Así, por ejemplo, si un documento está contenido en una carpeta que tiene el acceso permitido a todo el personal de OPTIM TECH, se considerará como “Uso Interno”. Si por lo contrario el acceso está restringido a únicamente el personal de un área, departamento o proyecto será considerada “Reservada”. Si el acceso a esta carpeta o documento está restringido a personas concretas, será considerado como “Secreto”.</w:t>
       </w:r>
     </w:p>
     <w:p>
@@ -5391,19 +3575,7 @@
         <w:rPr>
           <w:lang w:val="es-ES"/>
         </w:rPr>
-        <w:t xml:space="preserve">En caso de duda en la aplicación de estas medidas de clasificación, etiquetado y manipulación será imprescindible solicitar la ayuda del Responsable de Seguridad de la Información de </w:t>
-      </w:r>
-      <w:r>
-        <w:rPr>
-          <w:lang w:val="es-ES"/>
-        </w:rPr>
-        <w:t>OPTIM TECH</w:t>
-      </w:r>
-      <w:r>
-        <w:rPr>
-          <w:lang w:val="es-ES"/>
-        </w:rPr>
-        <w:t>.</w:t>
+        <w:t>En caso de duda en la aplicación de estas medidas de clasificación, etiquetado y manipulación será imprescindible solicitar la ayuda del Responsable de Seguridad de la Información de OPTIM TECH.</w:t>
       </w:r>
     </w:p>
     <w:p>
@@ -5456,19 +3628,7 @@
         <w:rPr>
           <w:lang w:val="es-ES_tradnl"/>
         </w:rPr>
-        <w:t xml:space="preserve">De acuerdo con la política de seguridad de la información de </w:t>
-      </w:r>
-      <w:r>
-        <w:rPr>
-          <w:lang w:val="es-ES_tradnl"/>
-        </w:rPr>
-        <w:t>OPTIM TECH</w:t>
-      </w:r>
-      <w:r>
-        <w:rPr>
-          <w:lang w:val="es-ES_tradnl"/>
-        </w:rPr>
-        <w:t>, se establece la siguiente normativa para el uso correcto de equipos, servicios e instalaciones:</w:t>
+        <w:t>De acuerdo con la política de seguridad de la información de OPTIM TECH, se establece la siguiente normativa para el uso correcto de equipos, servicios e instalaciones:</w:t>
       </w:r>
     </w:p>
     <w:p>
@@ -5501,49 +3661,7 @@
         <w:rPr>
           <w:lang w:val="es-ES"/>
         </w:rPr>
-        <w:t xml:space="preserve">Se debe avisar inmediatamente a los responsables o al área de soporte IT de </w:t>
-      </w:r>
-      <w:r>
-        <w:rPr>
-          <w:lang w:val="es-ES"/>
-        </w:rPr>
-        <w:t>OPTIM TECH</w:t>
-      </w:r>
-      <w:r>
-        <w:rPr>
-          <w:lang w:val="es-ES"/>
-        </w:rPr>
-        <w:t xml:space="preserve"> cuando se sospeche, detecte o sufra algún incidente de seguridad a través del canal establecido </w:t>
-      </w:r>
-      <w:r>
-        <w:rPr>
-          <w:lang w:val="es-ES"/>
-        </w:rPr>
-        <w:t>dev</w:t>
-      </w:r>
-      <w:r>
-        <w:rPr>
-          <w:lang w:val="es-ES"/>
-        </w:rPr>
-        <w:t>@</w:t>
-      </w:r>
-      <w:r>
-        <w:rPr>
-          <w:lang w:val="es-ES"/>
-        </w:rPr>
-        <w:t>optimtech.</w:t>
-      </w:r>
-      <w:r>
-        <w:rPr>
-          <w:lang w:val="es-ES"/>
-        </w:rPr>
-        <w:t>es</w:t>
-      </w:r>
-      <w:r>
-        <w:rPr>
-          <w:lang w:val="es-ES"/>
-        </w:rPr>
-        <w:t>.</w:t>
+        <w:t>Se debe avisar inmediatamente a los responsables o al área de soporte IT de OPTIM TECH cuando se sospeche, detecte o sufra algún incidente de seguridad a través del canal establecido dev@optimtech.es.</w:t>
       </w:r>
     </w:p>
     <w:p>
@@ -5652,21 +3770,7 @@
           <w:rFonts w:cs="Segoe UI"/>
           <w:lang w:val="es-ES"/>
         </w:rPr>
-        <w:t xml:space="preserve"> de </w:t>
-      </w:r>
-      <w:r>
-        <w:rPr>
-          <w:rFonts w:cs="Segoe UI"/>
-          <w:lang w:val="es-ES"/>
-        </w:rPr>
-        <w:t>OPTIM TECH</w:t>
-      </w:r>
-      <w:r>
-        <w:rPr>
-          <w:rFonts w:cs="Segoe UI"/>
-          <w:lang w:val="es-ES"/>
-        </w:rPr>
-        <w:t xml:space="preserve"> para que éste pueda subsanar el incidente en el menor tiempo posible y asignar una nueva contraseña.</w:t>
+        <w:t xml:space="preserve"> de OPTIM TECH para que éste pueda subsanar el incidente en el menor tiempo posible y asignar una nueva contraseña.</w:t>
       </w:r>
     </w:p>
     <w:p>
@@ -5687,21 +3791,7 @@
           <w:rFonts w:cs="Segoe UI"/>
           <w:lang w:val="es-ES_tradnl"/>
         </w:rPr>
-        <w:t xml:space="preserve">En ningún caso se introducirá la contraseña en una aplicación o página web que no sea verificada y expresamente autorizada por </w:t>
-      </w:r>
-      <w:r>
-        <w:rPr>
-          <w:rFonts w:cs="Segoe UI"/>
-          <w:lang w:val="es-ES_tradnl"/>
-        </w:rPr>
-        <w:t>OPTIM TECH</w:t>
-      </w:r>
-      <w:r>
-        <w:rPr>
-          <w:rFonts w:cs="Segoe UI"/>
-          <w:lang w:val="es-ES_tradnl"/>
-        </w:rPr>
-        <w:t>.</w:t>
+        <w:t>En ningún caso se introducirá la contraseña en una aplicación o página web que no sea verificada y expresamente autorizada por OPTIM TECH.</w:t>
       </w:r>
     </w:p>
     <w:p>
@@ -5741,35 +3831,7 @@
           <w:rFonts w:cs="Segoe UI"/>
           <w:lang w:val="es-ES_tradnl"/>
         </w:rPr>
-        <w:t xml:space="preserve">No se debe utilizar sin autorización la cuenta de correo electrónico de </w:t>
-      </w:r>
-      <w:r>
-        <w:rPr>
-          <w:rFonts w:cs="Segoe UI"/>
-          <w:lang w:val="es-ES_tradnl"/>
-        </w:rPr>
-        <w:t>OPTIM TECH</w:t>
-      </w:r>
-      <w:r>
-        <w:rPr>
-          <w:rFonts w:cs="Segoe UI"/>
-          <w:lang w:val="es-ES_tradnl"/>
-        </w:rPr>
-        <w:t xml:space="preserve"> para comunicarse con terceros en nombre o representación de </w:t>
-      </w:r>
-      <w:r>
-        <w:rPr>
-          <w:rFonts w:cs="Segoe UI"/>
-          <w:lang w:val="es-ES_tradnl"/>
-        </w:rPr>
-        <w:t>OPTIM TECH</w:t>
-      </w:r>
-      <w:r>
-        <w:rPr>
-          <w:rFonts w:cs="Segoe UI"/>
-          <w:lang w:val="es-ES_tradnl"/>
-        </w:rPr>
-        <w:t xml:space="preserve"> por motivos ajenos a las tareas profesionales encomendadas.</w:t>
+        <w:t>No se debe utilizar sin autorización la cuenta de correo electrónico de OPTIM TECH para comunicarse con terceros en nombre o representación de OPTIM TECH por motivos ajenos a las tareas profesionales encomendadas.</w:t>
       </w:r>
     </w:p>
     <w:p>
@@ -5850,21 +3912,7 @@
           <w:rFonts w:cs="Segoe UI"/>
           <w:lang w:val="es-ES_tradnl"/>
         </w:rPr>
-        <w:t xml:space="preserve">Envío de correos a un número elevado de destinatarios sin autorización, especialmente si son destinatarios externos a </w:t>
-      </w:r>
-      <w:r>
-        <w:rPr>
-          <w:rFonts w:cs="Segoe UI"/>
-          <w:lang w:val="es-ES_tradnl"/>
-        </w:rPr>
-        <w:t>OPTIM TECH</w:t>
-      </w:r>
-      <w:r>
-        <w:rPr>
-          <w:rFonts w:cs="Segoe UI"/>
-          <w:lang w:val="es-ES_tradnl"/>
-        </w:rPr>
-        <w:t xml:space="preserve">. </w:t>
+        <w:t xml:space="preserve">Envío de correos a un número elevado de destinatarios sin autorización, especialmente si son destinatarios externos a OPTIM TECH. </w:t>
       </w:r>
     </w:p>
     <w:p>
@@ -5898,21 +3946,7 @@
           <w:rFonts w:cs="Segoe UI"/>
           <w:lang w:val="es-ES_tradnl"/>
         </w:rPr>
-        <w:t xml:space="preserve">de </w:t>
-      </w:r>
-      <w:r>
-        <w:rPr>
-          <w:rFonts w:cs="Segoe UI"/>
-          <w:lang w:val="es-ES_tradnl"/>
-        </w:rPr>
-        <w:t>OPTIM TECH</w:t>
-      </w:r>
-      <w:r>
-        <w:rPr>
-          <w:rFonts w:cs="Segoe UI"/>
-          <w:lang w:val="es-ES_tradnl"/>
-        </w:rPr>
-        <w:t>.</w:t>
+        <w:t>de OPTIM TECH.</w:t>
       </w:r>
     </w:p>
     <w:p>
@@ -5933,12 +3967,6 @@
           <w:lang w:val="es-ES"/>
         </w:rPr>
         <w:t xml:space="preserve">Cuando se reenvíen correos, se debe evitar incluir el historial del correo a no ser que sea estrictamente necesario. En caso de que sea necesario hacerlo, se debe revisar que el contenido </w:t>
-      </w:r>
-      <w:r>
-        <w:rPr>
-          <w:rFonts w:cs="Segoe UI"/>
-          <w:lang w:val="es-ES"/>
-        </w:rPr>
         <w:lastRenderedPageBreak/>
         <w:t>sea relevante para todos los destinatarios y se tiene que evitar la divulgación de las direcciones de correo contenidas en dicho historial u cualquier otra información confidencial.</w:t>
       </w:r>
@@ -5980,21 +4008,7 @@
           <w:rFonts w:cs="Segoe UI"/>
           <w:lang w:val="es-ES_tradnl"/>
         </w:rPr>
-        <w:t xml:space="preserve">Si se accede al correo desde medios diferentes a los propios de </w:t>
-      </w:r>
-      <w:r>
-        <w:rPr>
-          <w:rFonts w:cs="Segoe UI"/>
-          <w:lang w:val="es-ES_tradnl"/>
-        </w:rPr>
-        <w:t>OPTIM TECH</w:t>
-      </w:r>
-      <w:r>
-        <w:rPr>
-          <w:rFonts w:cs="Segoe UI"/>
-          <w:lang w:val="es-ES_tradnl"/>
-        </w:rPr>
-        <w:t xml:space="preserve"> se deben extremar las precauciones con el lugar desde el que se accede al correo, siempre vigilar que </w:t>
+        <w:t xml:space="preserve">Si se accede al correo desde medios diferentes a los propios de OPTIM TECH se deben extremar las precauciones con el lugar desde el que se accede al correo, siempre vigilar que </w:t>
       </w:r>
       <w:r>
         <w:rPr>
@@ -6042,21 +4056,7 @@
           <w:rFonts w:cs="Segoe UI"/>
           <w:lang w:val="es-ES_tradnl"/>
         </w:rPr>
-        <w:t xml:space="preserve">de </w:t>
-      </w:r>
-      <w:r>
-        <w:rPr>
-          <w:rFonts w:cs="Segoe UI"/>
-          <w:lang w:val="es-ES_tradnl"/>
-        </w:rPr>
-        <w:t>OPTIM TECH</w:t>
-      </w:r>
-      <w:r>
-        <w:rPr>
-          <w:rFonts w:cs="Segoe UI"/>
-          <w:lang w:val="es-ES_tradnl"/>
-        </w:rPr>
-        <w:t>.</w:t>
+        <w:t>de OPTIM TECH.</w:t>
       </w:r>
     </w:p>
     <w:p>
@@ -6116,35 +4116,7 @@
           <w:rFonts w:cs="Segoe UI"/>
           <w:lang w:val="es-ES"/>
         </w:rPr>
-        <w:t xml:space="preserve">La utilización de internet a través de los accesos proporcionados por </w:t>
-      </w:r>
-      <w:r>
-        <w:rPr>
-          <w:rFonts w:cs="Segoe UI"/>
-          <w:lang w:val="es-ES"/>
-        </w:rPr>
-        <w:t>OPTIM TECH</w:t>
-      </w:r>
-      <w:r>
-        <w:rPr>
-          <w:rFonts w:cs="Segoe UI"/>
-          <w:lang w:val="es-ES"/>
-        </w:rPr>
-        <w:t xml:space="preserve"> debe limitarse a la obtención de información relacionada con el trabajo que se desempeña como personal o colaborador de </w:t>
-      </w:r>
-      <w:r>
-        <w:rPr>
-          <w:rFonts w:cs="Segoe UI"/>
-          <w:lang w:val="es-ES"/>
-        </w:rPr>
-        <w:t>OPTIM TECH</w:t>
-      </w:r>
-      <w:r>
-        <w:rPr>
-          <w:rFonts w:cs="Segoe UI"/>
-          <w:lang w:val="es-ES"/>
-        </w:rPr>
-        <w:t>, por tanto, debiendo evitarse toda utilización que no tenga una mínima relación con las funciones de su puesto de trabajo, o que pudiera aportar una mejora en el desempeño de sus tareas.</w:t>
+        <w:t>La utilización de internet a través de los accesos proporcionados por OPTIM TECH debe limitarse a la obtención de información relacionada con el trabajo que se desempeña como personal o colaborador de OPTIM TECH, por tanto, debiendo evitarse toda utilización que no tenga una mínima relación con las funciones de su puesto de trabajo, o que pudiera aportar una mejora en el desempeño de sus tareas.</w:t>
       </w:r>
     </w:p>
     <w:p>
@@ -6184,21 +4156,7 @@
           <w:rFonts w:cs="Segoe UI"/>
           <w:lang w:val="es-ES"/>
         </w:rPr>
-        <w:t xml:space="preserve">Se debe respetar la prohibición de utilizar programas de compartición de contenidos, habitualmente usados para la descarga de archivos de música, vídeo, etc. así como programas o webs de descarga o retransmisión de contenidos audiovisuales en streaming y que supongan un uso abusivo de los recursos de </w:t>
-      </w:r>
-      <w:r>
-        <w:rPr>
-          <w:rFonts w:cs="Segoe UI"/>
-          <w:lang w:val="es-ES"/>
-        </w:rPr>
-        <w:t>OPTIM TECH</w:t>
-      </w:r>
-      <w:r>
-        <w:rPr>
-          <w:rFonts w:cs="Segoe UI"/>
-          <w:lang w:val="es-ES"/>
-        </w:rPr>
-        <w:t>.</w:t>
+        <w:t>Se debe respetar la prohibición de utilizar programas de compartición de contenidos, habitualmente usados para la descarga de archivos de música, vídeo, etc. así como programas o webs de descarga o retransmisión de contenidos audiovisuales en streaming y que supongan un uso abusivo de los recursos de OPTIM TECH.</w:t>
       </w:r>
     </w:p>
     <w:p>
@@ -6231,21 +4189,7 @@
           <w:rFonts w:cs="Segoe UI"/>
           <w:lang w:val="es-ES"/>
         </w:rPr>
-        <w:t xml:space="preserve">de </w:t>
-      </w:r>
-      <w:r>
-        <w:rPr>
-          <w:rFonts w:cs="Segoe UI"/>
-          <w:lang w:val="es-ES"/>
-        </w:rPr>
-        <w:t>OPTIM TECH</w:t>
-      </w:r>
-      <w:r>
-        <w:rPr>
-          <w:rFonts w:cs="Segoe UI"/>
-          <w:lang w:val="es-ES"/>
-        </w:rPr>
-        <w:t>.</w:t>
+        <w:t>de OPTIM TECH.</w:t>
       </w:r>
     </w:p>
     <w:p>
@@ -6306,56 +4250,7 @@
           <w:lang w:val="es-ES"/>
         </w:rPr>
         <w:lastRenderedPageBreak/>
-        <w:t>Al navegar por las páginas web, s</w:t>
-      </w:r>
-      <w:r>
-        <w:rPr>
-          <w:rFonts w:cs="Segoe UI"/>
-          <w:lang w:val="es-ES"/>
-        </w:rPr>
-        <w:t xml:space="preserve">e deberá </w:t>
-      </w:r>
-      <w:r>
-        <w:rPr>
-          <w:rFonts w:cs="Segoe UI"/>
-          <w:lang w:val="es-ES"/>
-        </w:rPr>
-        <w:t>prohibir</w:t>
-      </w:r>
-      <w:r>
-        <w:rPr>
-          <w:rFonts w:cs="Segoe UI"/>
-          <w:lang w:val="es-ES"/>
-        </w:rPr>
-        <w:t xml:space="preserve"> </w:t>
-      </w:r>
-      <w:r>
-        <w:rPr>
-          <w:rFonts w:cs="Segoe UI"/>
-          <w:lang w:val="es-ES"/>
-        </w:rPr>
-        <w:t>la instalación de las cookies que no sean estrictamente necesarias al navegar por las páginas web. Ante la solicitud de consentimiento para la instalación de coo</w:t>
-      </w:r>
-      <w:r>
-        <w:rPr>
-          <w:rFonts w:cs="Segoe UI"/>
-          <w:lang w:val="es-ES"/>
-        </w:rPr>
-        <w:t>k</w:t>
-      </w:r>
-      <w:r>
-        <w:rPr>
-          <w:rFonts w:cs="Segoe UI"/>
-          <w:lang w:val="es-ES"/>
-        </w:rPr>
-        <w:t>ies se deben den</w:t>
-      </w:r>
-      <w:r>
-        <w:rPr>
-          <w:rFonts w:cs="Segoe UI"/>
-          <w:lang w:val="es-ES"/>
-        </w:rPr>
-        <w:t>egar todas las que no sean cookies técnicas.</w:t>
+        <w:t>Al navegar por las páginas web, se deberá prohibir la instalación de las cookies que no sean estrictamente necesarias al navegar por las páginas web. Ante la solicitud de consentimiento para la instalación de cookies se deben denegar todas las que no sean cookies técnicas.</w:t>
       </w:r>
     </w:p>
     <w:p>
@@ -6427,35 +4322,7 @@
           <w:rFonts w:cs="Segoe UI"/>
           <w:lang w:val="es-ES_tradnl"/>
         </w:rPr>
-        <w:t xml:space="preserve">Está terminantemente prohibida la visualización o descarga de archivos y contenidos ilegales, pornográficos o inapropiados y sin relación con la actividad de </w:t>
-      </w:r>
-      <w:r>
-        <w:rPr>
-          <w:rFonts w:cs="Segoe UI"/>
-          <w:lang w:val="es-ES_tradnl"/>
-        </w:rPr>
-        <w:t>OPTIM TECH</w:t>
-      </w:r>
-      <w:r>
-        <w:rPr>
-          <w:rFonts w:cs="Segoe UI"/>
-          <w:lang w:val="es-ES_tradnl"/>
-        </w:rPr>
-        <w:t xml:space="preserve"> desde las instalaciones y equipos de </w:t>
-      </w:r>
-      <w:r>
-        <w:rPr>
-          <w:rFonts w:cs="Segoe UI"/>
-          <w:lang w:val="es-ES_tradnl"/>
-        </w:rPr>
-        <w:t>OPTIM TECH</w:t>
-      </w:r>
-      <w:r>
-        <w:rPr>
-          <w:rFonts w:cs="Segoe UI"/>
-          <w:lang w:val="es-ES_tradnl"/>
-        </w:rPr>
-        <w:t xml:space="preserve">. </w:t>
+        <w:t xml:space="preserve">Está terminantemente prohibida la visualización o descarga de archivos y contenidos ilegales, pornográficos o inapropiados y sin relación con la actividad de OPTIM TECH desde las instalaciones y equipos de OPTIM TECH. </w:t>
       </w:r>
     </w:p>
     <w:p>
@@ -6541,14 +4408,7 @@
           <w:rFonts w:cs="Segoe UI"/>
           <w:lang w:val="es-ES_tradnl"/>
         </w:rPr>
-        <w:t xml:space="preserve">Se deberá verificar que están libres de virus u otro software malicioso antes de utilizarlos con los ordenadores de </w:t>
-      </w:r>
-      <w:r>
-        <w:rPr>
-          <w:rFonts w:cs="Segoe UI"/>
-          <w:lang w:val="es-ES_tradnl"/>
-        </w:rPr>
-        <w:t>OPTIM TECH</w:t>
+        <w:t>Se deberá verificar que están libres de virus u otro software malicioso antes de utilizarlos con los ordenadores de OPTIM TECH</w:t>
       </w:r>
     </w:p>
     <w:p>
@@ -6734,35 +4594,7 @@
           <w:rFonts w:cs="Segoe UI"/>
           <w:lang w:val="es-ES"/>
         </w:rPr>
-        <w:t xml:space="preserve">Todos los documentos que deban crear o procesar las personas trabajadoras en el desarrollo de las funciones encomendadas dentro de </w:t>
-      </w:r>
-      <w:r>
-        <w:rPr>
-          <w:rFonts w:cs="Segoe UI"/>
-          <w:lang w:val="es-ES"/>
-        </w:rPr>
-        <w:t>OPTIM TECH</w:t>
-      </w:r>
-      <w:r>
-        <w:rPr>
-          <w:rFonts w:cs="Segoe UI"/>
-          <w:lang w:val="es-ES"/>
-        </w:rPr>
-        <w:t xml:space="preserve"> deben almacenarse en las unidades habilitadas a tal efecto </w:t>
-      </w:r>
-      <w:r>
-        <w:rPr>
-          <w:rFonts w:cs="Segoe UI"/>
-          <w:lang w:val="es-ES"/>
-        </w:rPr>
-        <w:t>en</w:t>
-      </w:r>
-      <w:r>
-        <w:rPr>
-          <w:rFonts w:cs="Segoe UI"/>
-          <w:lang w:val="es-ES"/>
-        </w:rPr>
-        <w:t xml:space="preserve"> OneDrive/Sharepoint.</w:t>
+        <w:t>Todos los documentos que deban crear o procesar las personas trabajadoras en el desarrollo de las funciones encomendadas dentro de OPTIM TECH deben almacenarse en las unidades habilitadas a tal efecto en OneDrive/Sharepoint.</w:t>
       </w:r>
     </w:p>
     <w:p>
@@ -6782,21 +4614,7 @@
           <w:rFonts w:cs="Segoe UI"/>
           <w:lang w:val="es-ES_tradnl"/>
         </w:rPr>
-        <w:t xml:space="preserve">No está permitido almacenar permanentemente información de </w:t>
-      </w:r>
-      <w:r>
-        <w:rPr>
-          <w:rFonts w:cs="Segoe UI"/>
-          <w:lang w:val="es-ES_tradnl"/>
-        </w:rPr>
-        <w:t>OPTIM TECH</w:t>
-      </w:r>
-      <w:r>
-        <w:rPr>
-          <w:rFonts w:cs="Segoe UI"/>
-          <w:lang w:val="es-ES_tradnl"/>
-        </w:rPr>
-        <w:t xml:space="preserve"> en el disco duro de los equipos de trabajo, excepto en aquellas carpetas que se sincronizan con las unidades de red en la nube. </w:t>
+        <w:t xml:space="preserve">No está permitido almacenar permanentemente información de OPTIM TECH en el disco duro de los equipos de trabajo, excepto en aquellas carpetas que se sincronizan con las unidades de red en la nube. </w:t>
       </w:r>
     </w:p>
     <w:p>
@@ -6833,21 +4651,7 @@
           <w:rFonts w:cs="Segoe UI"/>
           <w:lang w:val="es-ES"/>
         </w:rPr>
-        <w:t>No se debe compartir información, especialmente con OneDrive/Sharepoint</w:t>
-      </w:r>
-      <w:r>
-        <w:rPr>
-          <w:rFonts w:cs="Segoe UI"/>
-          <w:lang w:val="es-ES"/>
-        </w:rPr>
-        <w:t xml:space="preserve">, </w:t>
-      </w:r>
-      <w:r>
-        <w:rPr>
-          <w:rFonts w:cs="Segoe UI"/>
-          <w:lang w:val="es-ES"/>
-        </w:rPr>
-        <w:t>Google Drive, Dropbox, WeTransfer o servicios en la nube similares sin haberse asegurado previamente de que únicamente el destinatario autorizado podrá acceder a la información compartida.</w:t>
+        <w:t>No se debe compartir información, especialmente con OneDrive/Sharepoint, Google Drive, Dropbox, WeTransfer o servicios en la nube similares sin haberse asegurado previamente de que únicamente el destinatario autorizado podrá acceder a la información compartida.</w:t>
       </w:r>
     </w:p>
     <w:p>
@@ -6919,21 +4723,7 @@
           <w:rFonts w:cs="Segoe UI"/>
           <w:lang w:val="es-ES_tradnl"/>
         </w:rPr>
-        <w:t xml:space="preserve">Antes de compartir, difundir, publicar o enviar cualquier fichero o documento, especialmente cuando el destinatario es un tercero no vinculado a </w:t>
-      </w:r>
-      <w:r>
-        <w:rPr>
-          <w:rFonts w:cs="Segoe UI"/>
-          <w:lang w:val="es-ES_tradnl"/>
-        </w:rPr>
-        <w:t>OPTIM TECH</w:t>
-      </w:r>
-      <w:r>
-        <w:rPr>
-          <w:rFonts w:cs="Segoe UI"/>
-          <w:lang w:val="es-ES_tradnl"/>
-        </w:rPr>
-        <w:t>, se debe asegurar de que no incluye metadatos (propiedades, autores, comentarios, revisiones, …) que no sean pertinentes, que puedan contener información confidencial o no sean relevantes para el destinatario. Para ello, si es necesario, se ejecutará un proceso de limpieza del documento.</w:t>
+        <w:t>Antes de compartir, difundir, publicar o enviar cualquier fichero o documento, especialmente cuando el destinatario es un tercero no vinculado a OPTIM TECH, se debe asegurar de que no incluye metadatos (propiedades, autores, comentarios, revisiones, …) que no sean pertinentes, que puedan contener información confidencial o no sean relevantes para el destinatario. Para ello, si es necesario, se ejecutará un proceso de limpieza del documento.</w:t>
       </w:r>
     </w:p>
     <w:p>
@@ -6954,21 +4744,7 @@
           <w:rFonts w:cs="Segoe UI"/>
           <w:lang w:val="es-ES_tradnl"/>
         </w:rPr>
-        <w:t xml:space="preserve">No se puede eliminar ni borrar ninguna información de los equipos y soportes proporcionados por </w:t>
-      </w:r>
-      <w:r>
-        <w:rPr>
-          <w:rFonts w:cs="Segoe UI"/>
-          <w:lang w:val="es-ES_tradnl"/>
-        </w:rPr>
-        <w:t>OPTIM TECH</w:t>
-      </w:r>
-      <w:r>
-        <w:rPr>
-          <w:rFonts w:cs="Segoe UI"/>
-          <w:lang w:val="es-ES_tradnl"/>
-        </w:rPr>
-        <w:t xml:space="preserve"> cuando finalice la relación laboral o profesional.</w:t>
+        <w:t>No se puede eliminar ni borrar ninguna información de los equipos y soportes proporcionados por OPTIM TECH cuando finalice la relación laboral o profesional.</w:t>
       </w:r>
     </w:p>
     <w:p>
@@ -7189,35 +4965,7 @@
           <w:rFonts w:cs="Segoe UI"/>
           <w:lang w:val="es-ES_tradnl"/>
         </w:rPr>
-        <w:t xml:space="preserve">No está permitido conectar dispositivos no autorizados a la red corporativa de </w:t>
-      </w:r>
-      <w:r>
-        <w:rPr>
-          <w:rFonts w:cs="Segoe UI"/>
-          <w:lang w:val="es-ES_tradnl"/>
-        </w:rPr>
-        <w:t>OPTIM TECH</w:t>
-      </w:r>
-      <w:r>
-        <w:rPr>
-          <w:rFonts w:cs="Segoe UI"/>
-          <w:lang w:val="es-ES_tradnl"/>
-        </w:rPr>
-        <w:t xml:space="preserve">, ya sea cableada o inalámbrica (wifi), o facilitar su acceso a personas externas a </w:t>
-      </w:r>
-      <w:r>
-        <w:rPr>
-          <w:rFonts w:cs="Segoe UI"/>
-          <w:lang w:val="es-ES_tradnl"/>
-        </w:rPr>
-        <w:t>OPTIM TECH</w:t>
-      </w:r>
-      <w:r>
-        <w:rPr>
-          <w:rFonts w:cs="Segoe UI"/>
-          <w:lang w:val="es-ES_tradnl"/>
-        </w:rPr>
-        <w:t>. La conexión a la red wifi interna está restringido al personal y equipos autorizados.</w:t>
+        <w:t>No está permitido conectar dispositivos no autorizados a la red corporativa de OPTIM TECH, ya sea cableada o inalámbrica (wifi), o facilitar su acceso a personas externas a OPTIM TECH. La conexión a la red wifi interna está restringido al personal y equipos autorizados.</w:t>
       </w:r>
     </w:p>
     <w:p>
@@ -7237,21 +4985,7 @@
           <w:rFonts w:cs="Segoe UI"/>
           <w:lang w:val="es-ES"/>
         </w:rPr>
-        <w:t xml:space="preserve">Las personas externas a </w:t>
-      </w:r>
-      <w:r>
-        <w:rPr>
-          <w:rFonts w:cs="Segoe UI"/>
-          <w:lang w:val="es-ES"/>
-        </w:rPr>
-        <w:t>OPTIM TECH</w:t>
-      </w:r>
-      <w:r>
-        <w:rPr>
-          <w:rFonts w:cs="Segoe UI"/>
-          <w:lang w:val="es-ES"/>
-        </w:rPr>
-        <w:t xml:space="preserve"> únicamente podrán acceder a la red WIFI para invitados, si existe, configurada con el único propósito de permitir el acceso a internet.</w:t>
+        <w:t>Las personas externas a OPTIM TECH únicamente podrán acceder a la red WIFI para invitados, si existe, configurada con el único propósito de permitir el acceso a internet.</w:t>
       </w:r>
     </w:p>
     <w:p>
@@ -7311,21 +5045,7 @@
           <w:rFonts w:cs="Segoe UI"/>
           <w:lang w:val="es-ES_tradnl"/>
         </w:rPr>
-        <w:t xml:space="preserve">No está permitido instalar aplicaciones no homologadas y autorizadas por </w:t>
-      </w:r>
-      <w:r>
-        <w:rPr>
-          <w:rFonts w:cs="Segoe UI"/>
-          <w:lang w:val="es-ES_tradnl"/>
-        </w:rPr>
-        <w:t>OPTIM TECH</w:t>
-      </w:r>
-      <w:r>
-        <w:rPr>
-          <w:rFonts w:cs="Segoe UI"/>
-          <w:lang w:val="es-ES_tradnl"/>
-        </w:rPr>
-        <w:t>.</w:t>
+        <w:t>No está permitido instalar aplicaciones no homologadas y autorizadas por OPTIM TECH.</w:t>
       </w:r>
     </w:p>
     <w:p>
@@ -7345,21 +5065,7 @@
           <w:rFonts w:cs="Segoe UI"/>
           <w:lang w:val="es-ES_tradnl"/>
         </w:rPr>
-        <w:t xml:space="preserve">No está permitido modificar la configuración de los equipos y ordenadores sin el permiso expreso de los servicios informáticos de </w:t>
-      </w:r>
-      <w:r>
-        <w:rPr>
-          <w:rFonts w:cs="Segoe UI"/>
-          <w:lang w:val="es-ES_tradnl"/>
-        </w:rPr>
-        <w:t>OPTIM TECH</w:t>
-      </w:r>
-      <w:r>
-        <w:rPr>
-          <w:rFonts w:cs="Segoe UI"/>
-          <w:lang w:val="es-ES_tradnl"/>
-        </w:rPr>
-        <w:t xml:space="preserve">. </w:t>
+        <w:t xml:space="preserve">No está permitido modificar la configuración de los equipos y ordenadores sin el permiso expreso de los servicios informáticos de OPTIM TECH. </w:t>
       </w:r>
     </w:p>
     <w:p>
@@ -7689,35 +5395,7 @@
           <w:rFonts w:cs="Segoe UI"/>
           <w:lang w:val="es-ES"/>
         </w:rPr>
-        <w:t xml:space="preserve">Los dispositivos móviles (portátiles, teléfonos móviles, tabletas, etc.) son los que están intrínsecamente preparados para ser utilizados en ubicaciones que no son el puesto de trabajo habitual, fuera de las dependencias de </w:t>
-      </w:r>
-      <w:r>
-        <w:rPr>
-          <w:rFonts w:cs="Segoe UI"/>
-          <w:lang w:val="es-ES"/>
-        </w:rPr>
-        <w:t>OPTIM TECH</w:t>
-      </w:r>
-      <w:r>
-        <w:rPr>
-          <w:rFonts w:cs="Segoe UI"/>
-          <w:lang w:val="es-ES"/>
-        </w:rPr>
-        <w:t xml:space="preserve">, en tránsito o en ubicaciones remotas de teletrabajo. Por ello, cuando se utilicen dispositivos móviles, se debe tener un cuidado especial para asegurar que no se compromete la información de </w:t>
-      </w:r>
-      <w:r>
-        <w:rPr>
-          <w:rFonts w:cs="Segoe UI"/>
-          <w:lang w:val="es-ES"/>
-        </w:rPr>
-        <w:t>OPTIM TECH</w:t>
-      </w:r>
-      <w:r>
-        <w:rPr>
-          <w:rFonts w:cs="Segoe UI"/>
-          <w:lang w:val="es-ES"/>
-        </w:rPr>
-        <w:t xml:space="preserve"> teniendo en cuenta los riesgos de trabajar con dispositivos móviles en entornos desprotegidos.</w:t>
+        <w:t>Los dispositivos móviles (portátiles, teléfonos móviles, tabletas, etc.) son los que están intrínsecamente preparados para ser utilizados en ubicaciones que no son el puesto de trabajo habitual, fuera de las dependencias de OPTIM TECH, en tránsito o en ubicaciones remotas de teletrabajo. Por ello, cuando se utilicen dispositivos móviles, se debe tener un cuidado especial para asegurar que no se compromete la información de OPTIM TECH teniendo en cuenta los riesgos de trabajar con dispositivos móviles en entornos desprotegidos.</w:t>
       </w:r>
     </w:p>
     <w:p>
@@ -7753,56 +5431,7 @@
           <w:rFonts w:cs="Segoe UI"/>
           <w:lang w:val="es-ES"/>
         </w:rPr>
-        <w:t xml:space="preserve">a través del canal </w:t>
-      </w:r>
-      <w:r>
-        <w:rPr>
-          <w:rFonts w:cs="Segoe UI"/>
-          <w:lang w:val="es-ES"/>
-        </w:rPr>
-        <w:t xml:space="preserve">establecido </w:t>
-      </w:r>
-      <w:r>
-        <w:rPr>
-          <w:rFonts w:cs="Segoe UI"/>
-          <w:lang w:val="es-ES"/>
-        </w:rPr>
-        <w:t>dev</w:t>
-      </w:r>
-      <w:r>
-        <w:rPr>
-          <w:rFonts w:cs="Segoe UI"/>
-          <w:lang w:val="es-ES"/>
-        </w:rPr>
-        <w:t>@</w:t>
-      </w:r>
-      <w:r>
-        <w:rPr>
-          <w:rFonts w:cs="Segoe UI"/>
-          <w:lang w:val="es-ES"/>
-        </w:rPr>
-        <w:t>optimtech</w:t>
-      </w:r>
-      <w:r>
-        <w:rPr>
-          <w:rFonts w:cs="Segoe UI"/>
-          <w:lang w:val="es-ES"/>
-        </w:rPr>
-        <w:t>.</w:t>
-      </w:r>
-      <w:r>
-        <w:rPr>
-          <w:rFonts w:cs="Segoe UI"/>
-          <w:lang w:val="es-ES"/>
-        </w:rPr>
-        <w:t>es</w:t>
-      </w:r>
-      <w:r>
-        <w:rPr>
-          <w:rFonts w:cs="Segoe UI"/>
-          <w:lang w:val="es-ES"/>
-        </w:rPr>
-        <w:t>.</w:t>
+        <w:t>a través del canal establecido dev@optimtech.es.</w:t>
       </w:r>
     </w:p>
     <w:p>
@@ -7937,21 +5566,7 @@
           <w:rFonts w:cs="Segoe UI"/>
           <w:lang w:val="es-ES_tradnl"/>
         </w:rPr>
-        <w:t xml:space="preserve">El usuario debe velar por el buen estado de conservación de los dispositivos móviles. En caso de cualquier accidente que afecte al estado del equipo deberá comunicarlo inmediatamente al soporte informático de </w:t>
-      </w:r>
-      <w:r>
-        <w:rPr>
-          <w:rFonts w:cs="Segoe UI"/>
-          <w:lang w:val="es-ES_tradnl"/>
-        </w:rPr>
-        <w:t>OPTIM TECH</w:t>
-      </w:r>
-      <w:r>
-        <w:rPr>
-          <w:rFonts w:cs="Segoe UI"/>
-          <w:lang w:val="es-ES_tradnl"/>
-        </w:rPr>
-        <w:t>.</w:t>
+        <w:t>El usuario debe velar por el buen estado de conservación de los dispositivos móviles. En caso de cualquier accidente que afecte al estado del equipo deberá comunicarlo inmediatamente al soporte informático de OPTIM TECH.</w:t>
       </w:r>
     </w:p>
     <w:p>
@@ -7991,21 +5606,7 @@
           <w:rFonts w:cs="Segoe UI"/>
           <w:lang w:val="es-ES"/>
         </w:rPr>
-        <w:t xml:space="preserve">Los equipos y dispositivos móviles de </w:t>
-      </w:r>
-      <w:r>
-        <w:rPr>
-          <w:rFonts w:cs="Segoe UI"/>
-          <w:lang w:val="es-ES"/>
-        </w:rPr>
-        <w:t>OPTIM TECH</w:t>
-      </w:r>
-      <w:r>
-        <w:rPr>
-          <w:rFonts w:cs="Segoe UI"/>
-          <w:lang w:val="es-ES"/>
-        </w:rPr>
-        <w:t xml:space="preserve"> únicamente pueden ser utilizados por la persona a la que han sido asignados. </w:t>
+        <w:t xml:space="preserve">Los equipos y dispositivos móviles de OPTIM TECH únicamente pueden ser utilizados por la persona a la que han sido asignados. </w:t>
       </w:r>
     </w:p>
     <w:p>
@@ -8025,21 +5626,7 @@
           <w:rFonts w:cs="Segoe UI"/>
           <w:lang w:val="es-ES"/>
         </w:rPr>
-        <w:t xml:space="preserve">En ningún caso pueden ser utilizados por personas ajenas a </w:t>
-      </w:r>
-      <w:r>
-        <w:rPr>
-          <w:rFonts w:cs="Segoe UI"/>
-          <w:lang w:val="es-ES"/>
-        </w:rPr>
-        <w:t>OPTIM TECH</w:t>
-      </w:r>
-      <w:r>
-        <w:rPr>
-          <w:rFonts w:cs="Segoe UI"/>
-          <w:lang w:val="es-ES"/>
-        </w:rPr>
-        <w:t>, tal como, por ejemplo, familiares o convivientes.</w:t>
+        <w:t>En ningún caso pueden ser utilizados por personas ajenas a OPTIM TECH, tal como, por ejemplo, familiares o convivientes.</w:t>
       </w:r>
     </w:p>
     <w:p>
@@ -8059,21 +5646,7 @@
           <w:rFonts w:cs="Segoe UI"/>
           <w:lang w:val="es-ES_tradnl"/>
         </w:rPr>
-        <w:t xml:space="preserve">Los dispositivos móviles fuera de las oficinas de </w:t>
-      </w:r>
-      <w:r>
-        <w:rPr>
-          <w:rFonts w:cs="Segoe UI"/>
-          <w:lang w:val="es-ES_tradnl"/>
-        </w:rPr>
-        <w:t>OPTIM TECH</w:t>
-      </w:r>
-      <w:r>
-        <w:rPr>
-          <w:rFonts w:cs="Segoe UI"/>
-          <w:lang w:val="es-ES_tradnl"/>
-        </w:rPr>
-        <w:t xml:space="preserve"> deben ser utilizados únicamente en situaciones necesarias para el correcto desempeño laboral, tal como situaciones de teletrabajo o desplazamientos por motivos laborales. </w:t>
+        <w:t xml:space="preserve">Los dispositivos móviles fuera de las oficinas de OPTIM TECH deben ser utilizados únicamente en situaciones necesarias para el correcto desempeño laboral, tal como situaciones de teletrabajo o desplazamientos por motivos laborales. </w:t>
       </w:r>
     </w:p>
     <w:p>
@@ -8114,21 +5687,7 @@
           <w:lang w:val="es-ES_tradnl"/>
         </w:rPr>
         <w:lastRenderedPageBreak/>
-        <w:t xml:space="preserve">Si se produce cualquier incidente, daño o pérdida del dispositivo, se debe comunicar inmediatamente a los servicios informáticos de </w:t>
-      </w:r>
-      <w:r>
-        <w:rPr>
-          <w:rFonts w:cs="Segoe UI"/>
-          <w:lang w:val="es-ES_tradnl"/>
-        </w:rPr>
-        <w:t>OPTIM TECH</w:t>
-      </w:r>
-      <w:r>
-        <w:rPr>
-          <w:rFonts w:cs="Segoe UI"/>
-          <w:lang w:val="es-ES_tradnl"/>
-        </w:rPr>
-        <w:t>.</w:t>
+        <w:t>Si se produce cualquier incidente, daño o pérdida del dispositivo, se debe comunicar inmediatamente a los servicios informáticos de OPTIM TECH.</w:t>
       </w:r>
     </w:p>
     <w:p>
@@ -8168,21 +5727,7 @@
           <w:rFonts w:cs="Segoe UI"/>
           <w:lang w:val="es-ES_tradnl"/>
         </w:rPr>
-        <w:t xml:space="preserve">Estos dispositivos son propiedad de </w:t>
-      </w:r>
-      <w:r>
-        <w:rPr>
-          <w:rFonts w:cs="Segoe UI"/>
-          <w:lang w:val="es-ES_tradnl"/>
-        </w:rPr>
-        <w:t>OPTIM TECH</w:t>
-      </w:r>
-      <w:r>
-        <w:rPr>
-          <w:rFonts w:cs="Segoe UI"/>
-          <w:lang w:val="es-ES_tradnl"/>
-        </w:rPr>
-        <w:t xml:space="preserve"> y deben devolverse cuando se le solicite y cuando finalice la relación contractual.</w:t>
+        <w:t>Estos dispositivos son propiedad de OPTIM TECH y deben devolverse cuando se le solicite y cuando finalice la relación contractual.</w:t>
       </w:r>
     </w:p>
     <w:p>
@@ -8202,35 +5747,7 @@
           <w:rFonts w:cs="Segoe UI"/>
           <w:lang w:val="es-ES_tradnl"/>
         </w:rPr>
-        <w:t xml:space="preserve">Cualquier incidente en el uso de los dispositivos móviles y que pueda suponer un riesgo para la confidencialidad, integridad y disponibilidad de la información de </w:t>
-      </w:r>
-      <w:r>
-        <w:rPr>
-          <w:rFonts w:cs="Segoe UI"/>
-          <w:lang w:val="es-ES_tradnl"/>
-        </w:rPr>
-        <w:t>OPTIM TECH</w:t>
-      </w:r>
-      <w:r>
-        <w:rPr>
-          <w:rFonts w:cs="Segoe UI"/>
-          <w:lang w:val="es-ES_tradnl"/>
-        </w:rPr>
-        <w:t xml:space="preserve"> debe ser comunicada inmediatamente al área de soporte TIC de </w:t>
-      </w:r>
-      <w:r>
-        <w:rPr>
-          <w:rFonts w:cs="Segoe UI"/>
-          <w:lang w:val="es-ES_tradnl"/>
-        </w:rPr>
-        <w:t>OPTIM TECH</w:t>
-      </w:r>
-      <w:r>
-        <w:rPr>
-          <w:rFonts w:cs="Segoe UI"/>
-          <w:lang w:val="es-ES_tradnl"/>
-        </w:rPr>
-        <w:t>.</w:t>
+        <w:t>Cualquier incidente en el uso de los dispositivos móviles y que pueda suponer un riesgo para la confidencialidad, integridad y disponibilidad de la información de OPTIM TECH debe ser comunicada inmediatamente al área de soporte TIC de OPTIM TECH.</w:t>
       </w:r>
     </w:p>
     <w:p>
@@ -8390,21 +5907,7 @@
           <w:rFonts w:cs="Segoe UI"/>
           <w:lang w:val="es-ES_tradnl"/>
         </w:rPr>
-        <w:t xml:space="preserve">No se permite la instalación del correo corporativo, la descarga de contenidos corporativos o el tratamiento de información confidencial en los dispositivos particulares de las personas trabajadoras, excepto en casos expresamente autorizados y siempre que los dispositivos particulares estén sujetos a medidas de seguridad aprobadas por </w:t>
-      </w:r>
-      <w:r>
-        <w:rPr>
-          <w:rFonts w:cs="Segoe UI"/>
-          <w:lang w:val="es-ES_tradnl"/>
-        </w:rPr>
-        <w:t>OPTIM TECH</w:t>
-      </w:r>
-      <w:r>
-        <w:rPr>
-          <w:rFonts w:cs="Segoe UI"/>
-          <w:lang w:val="es-ES_tradnl"/>
-        </w:rPr>
-        <w:t>.</w:t>
+        <w:t>No se permite la instalación del correo corporativo, la descarga de contenidos corporativos o el tratamiento de información confidencial en los dispositivos particulares de las personas trabajadoras, excepto en casos expresamente autorizados y siempre que los dispositivos particulares estén sujetos a medidas de seguridad aprobadas por OPTIM TECH.</w:t>
       </w:r>
     </w:p>
     <w:p>
@@ -8537,21 +6040,7 @@
           <w:lang w:val="es-ES"/>
         </w:rPr>
         <w:lastRenderedPageBreak/>
-        <w:t xml:space="preserve">Se debe evitar el uso de redes wifi abiertas, especialmente cuando se accede desde espacios compartidos (cafeterías, bibliotecas, espacios </w:t>
-      </w:r>
-      <w:r>
-        <w:rPr>
-          <w:rFonts w:cs="Segoe UI"/>
-          <w:lang w:val="es-ES"/>
-        </w:rPr>
-        <w:t>públicos, …</w:t>
-      </w:r>
-      <w:r>
-        <w:rPr>
-          <w:rFonts w:cs="Segoe UI"/>
-          <w:lang w:val="es-ES"/>
-        </w:rPr>
-        <w:t>).</w:t>
+        <w:t>Se debe evitar el uso de redes wifi abiertas, especialmente cuando se accede desde espacios compartidos (cafeterías, bibliotecas, espacios públicos, …).</w:t>
       </w:r>
     </w:p>
     <w:p>
@@ -8593,21 +6082,7 @@
           <w:rFonts w:cs="Segoe UI"/>
           <w:lang w:val="es-ES_tradnl"/>
         </w:rPr>
-        <w:t xml:space="preserve">Se debe mantener la documentación en papel con información de </w:t>
-      </w:r>
-      <w:r>
-        <w:rPr>
-          <w:rFonts w:cs="Segoe UI"/>
-          <w:lang w:val="es-ES_tradnl"/>
-        </w:rPr>
-        <w:t>OPTIM TECH</w:t>
-      </w:r>
-      <w:r>
-        <w:rPr>
-          <w:rFonts w:cs="Segoe UI"/>
-          <w:lang w:val="es-ES_tradnl"/>
-        </w:rPr>
-        <w:t xml:space="preserve"> claramente segregada de otros documentos personales.</w:t>
+        <w:t>Se debe mantener la documentación en papel con información de OPTIM TECH claramente segregada de otros documentos personales.</w:t>
       </w:r>
     </w:p>
     <w:p>
@@ -8780,21 +6255,7 @@
           <w:rFonts w:cs="Segoe UI"/>
           <w:lang w:val="es-ES_tradnl"/>
         </w:rPr>
-        <w:t xml:space="preserve">El incumplimiento de estas recomendaciones implica que </w:t>
-      </w:r>
-      <w:r>
-        <w:rPr>
-          <w:rFonts w:cs="Segoe UI"/>
-          <w:lang w:val="es-ES_tradnl"/>
-        </w:rPr>
-        <w:t>OPTIM TECH</w:t>
-      </w:r>
-      <w:r>
-        <w:rPr>
-          <w:rFonts w:cs="Segoe UI"/>
-          <w:lang w:val="es-ES_tradnl"/>
-        </w:rPr>
-        <w:t xml:space="preserve"> no pueda garantizar la expectativa de privacidad de la persona trabajadora.</w:t>
+        <w:t>El incumplimiento de estas recomendaciones implica que OPTIM TECH no pueda garantizar la expectativa de privacidad de la persona trabajadora.</w:t>
       </w:r>
     </w:p>
     <w:p>
@@ -8814,42 +6275,7 @@
           <w:rFonts w:cs="Segoe UI"/>
           <w:lang w:val="es-ES"/>
         </w:rPr>
-        <w:t xml:space="preserve">a través del </w:t>
-      </w:r>
-      <w:r>
-        <w:rPr>
-          <w:rFonts w:cs="Segoe UI"/>
-          <w:lang w:val="es-ES"/>
-        </w:rPr>
-        <w:t xml:space="preserve">canal </w:t>
-      </w:r>
-      <w:r>
-        <w:rPr>
-          <w:rFonts w:cs="Segoe UI"/>
-          <w:lang w:val="es-ES"/>
-        </w:rPr>
-        <w:t>dev</w:t>
-      </w:r>
-      <w:r>
-        <w:rPr>
-          <w:rFonts w:cs="Segoe UI"/>
-          <w:lang w:val="es-ES"/>
-        </w:rPr>
-        <w:t>@optimtech.</w:t>
-      </w:r>
-      <w:r>
-        <w:rPr>
-          <w:rFonts w:cs="Segoe UI"/>
-          <w:lang w:val="es-ES"/>
-        </w:rPr>
-        <w:t>es</w:t>
-      </w:r>
-      <w:r>
-        <w:rPr>
-          <w:rFonts w:cs="Segoe UI"/>
-          <w:lang w:val="es-ES"/>
-        </w:rPr>
-        <w:t>:</w:t>
+        <w:t>a través del canal dev@optimtech.es:</w:t>
       </w:r>
     </w:p>
     <w:p>
@@ -9011,21 +6437,7 @@
           <w:rFonts w:cs="Segoe UI"/>
           <w:lang w:val="es-ES_tradnl"/>
         </w:rPr>
-        <w:t xml:space="preserve">No revelar o divulgar la información confidencial, no difundirla, ya sea directamente o mediante terceros, así como no ponerla a disposición de personas que no precisen de la misma para el adecuado desarrollo de sus funciones dentro de la empresa, ni de terceras personas ajenas a la organización, sin el previo consentimiento expreso de </w:t>
-      </w:r>
-      <w:r>
-        <w:rPr>
-          <w:rFonts w:cs="Segoe UI"/>
-          <w:lang w:val="es-ES_tradnl"/>
-        </w:rPr>
-        <w:t>OPTIM TECH</w:t>
-      </w:r>
-      <w:r>
-        <w:rPr>
-          <w:rFonts w:cs="Segoe UI"/>
-          <w:lang w:val="es-ES_tradnl"/>
-        </w:rPr>
-        <w:t xml:space="preserve"> </w:t>
+        <w:t xml:space="preserve">No revelar o divulgar la información confidencial, no difundirla, ya sea directamente o mediante terceros, así como no ponerla a disposición de personas que no precisen de la misma para el adecuado desarrollo de sus funciones dentro de la empresa, ni de terceras personas ajenas a la organización, sin el previo consentimiento expreso de OPTIM TECH </w:t>
       </w:r>
     </w:p>
     <w:p>
@@ -9071,21 +6483,7 @@
           <w:rFonts w:cs="Segoe UI"/>
           <w:lang w:val="es-ES"/>
         </w:rPr>
-        <w:t xml:space="preserve">Respetar escrupulosamente cualquier instrucción que establezca </w:t>
-      </w:r>
-      <w:r>
-        <w:rPr>
-          <w:rFonts w:cs="Segoe UI"/>
-          <w:lang w:val="es-ES"/>
-        </w:rPr>
-        <w:t>OPTIM TECH</w:t>
-      </w:r>
-      <w:r>
-        <w:rPr>
-          <w:rFonts w:cs="Segoe UI"/>
-          <w:lang w:val="es-ES"/>
-        </w:rPr>
-        <w:t xml:space="preserve"> en materia de protección de datos de carácter personal.</w:t>
+        <w:t>Respetar escrupulosamente cualquier instrucción que establezca OPTIM TECH en materia de protección de datos de carácter personal.</w:t>
       </w:r>
     </w:p>
     <w:p>
@@ -9114,14 +6512,7 @@
           <w:rFonts w:cs="Segoe UI"/>
           <w:lang w:val="es-ES_tradnl"/>
         </w:rPr>
-        <w:t>OPTIM TECH</w:t>
-      </w:r>
-      <w:r>
-        <w:rPr>
-          <w:rFonts w:cs="Segoe UI"/>
-          <w:lang w:val="es-ES_tradnl"/>
-        </w:rPr>
-        <w:t>.</w:t>
+        <w:t>OPTIM TECH.</w:t>
       </w:r>
     </w:p>
     <w:p>
@@ -9143,21 +6534,7 @@
           <w:rFonts w:cs="Segoe UI"/>
           <w:lang w:val="es-ES_tradnl"/>
         </w:rPr>
-        <w:t xml:space="preserve">No recopilar nuevos tipos de datos personales sin que sean autorizados por </w:t>
-      </w:r>
-      <w:r>
-        <w:rPr>
-          <w:rFonts w:cs="Segoe UI"/>
-          <w:lang w:val="es-ES_tradnl"/>
-        </w:rPr>
-        <w:t>OPTIM TECH</w:t>
-      </w:r>
-      <w:r>
-        <w:rPr>
-          <w:rFonts w:cs="Segoe UI"/>
-          <w:lang w:val="es-ES_tradnl"/>
-        </w:rPr>
-        <w:t>.</w:t>
+        <w:t>No recopilar nuevos tipos de datos personales sin que sean autorizados por OPTIM TECH.</w:t>
       </w:r>
       <w:bookmarkEnd w:id="66"/>
     </w:p>
@@ -9257,13 +6634,7 @@
         <w:rPr>
           <w:lang w:val="es-ES_tradnl"/>
         </w:rPr>
-        <w:t>La información que se incorpora a los modelos queda integrada y a disposición de todos los usuarios</w:t>
-      </w:r>
-      <w:r>
-        <w:rPr>
-          <w:lang w:val="es-ES_tradnl"/>
-        </w:rPr>
-        <w:t xml:space="preserve"> de estos modelos.</w:t>
+        <w:t>La información que se incorpora a los modelos queda integrada y a disposición de todos los usuarios de estos modelos.</w:t>
       </w:r>
     </w:p>
     <w:p>
@@ -9383,19 +6754,7 @@
         <w:rPr>
           <w:lang w:val="es-ES_tradnl"/>
         </w:rPr>
-        <w:t xml:space="preserve">Protección de la Privacidad y Seguridad de la Información:  Todo uso de </w:t>
-      </w:r>
-      <w:r>
-        <w:rPr>
-          <w:lang w:val="es-ES_tradnl"/>
-        </w:rPr>
-        <w:t xml:space="preserve">herramientas de </w:t>
-      </w:r>
-      <w:r>
-        <w:rPr>
-          <w:lang w:val="es-ES_tradnl"/>
-        </w:rPr>
-        <w:t>IA debe ser conforme a las normativas vigentes de privacidad de datos y seguridad de la información.</w:t>
+        <w:t>Protección de la Privacidad y Seguridad de la Información:  Todo uso de herramientas de IA debe ser conforme a las normativas vigentes de privacidad de datos y seguridad de la información.</w:t>
       </w:r>
     </w:p>
     <w:p>
@@ -9613,31 +6972,7 @@
         <w:rPr>
           <w:lang w:val="es-ES_tradnl"/>
         </w:rPr>
-        <w:t xml:space="preserve">Únicamente se podrán utilizar herramientas de IA que hayan sido autorizadas y administradas por </w:t>
-      </w:r>
-      <w:r>
-        <w:rPr>
-          <w:lang w:val="es-ES_tradnl"/>
-        </w:rPr>
-        <w:t>OPTIM TECH</w:t>
-      </w:r>
-      <w:r>
-        <w:rPr>
-          <w:lang w:val="es-ES_tradnl"/>
-        </w:rPr>
-        <w:t xml:space="preserve"> tras haber llevado a cabo una evaluación de riesgos para garantizar que cumple con los estándares de seguridad de </w:t>
-      </w:r>
-      <w:r>
-        <w:rPr>
-          <w:lang w:val="es-ES_tradnl"/>
-        </w:rPr>
-        <w:t>OPTIM TECH</w:t>
-      </w:r>
-      <w:r>
-        <w:rPr>
-          <w:lang w:val="es-ES_tradnl"/>
-        </w:rPr>
-        <w:t>.</w:t>
+        <w:t>Únicamente se podrán utilizar herramientas de IA que hayan sido autorizadas y administradas por OPTIM TECH tras haber llevado a cabo una evaluación de riesgos para garantizar que cumple con los estándares de seguridad de OPTIM TECH.</w:t>
       </w:r>
     </w:p>
     <w:p>
@@ -9655,13 +6990,7 @@
         <w:rPr>
           <w:lang w:val="es-ES_tradnl"/>
         </w:rPr>
-        <w:t>Está prohibido introducir, almacenar o procesar información clasificada, personal o crítica en sistemas de IA que no cuenten con la</w:t>
-      </w:r>
-      <w:r>
-        <w:rPr>
-          <w:lang w:val="es-ES_tradnl"/>
-        </w:rPr>
-        <w:t>s garantías de seguridad y privacidad adecuadas.</w:t>
+        <w:t>Está prohibido introducir, almacenar o procesar información clasificada, personal o crítica en sistemas de IA que no cuenten con las garantías de seguridad y privacidad adecuadas.</w:t>
       </w:r>
     </w:p>
     <w:p>
@@ -9736,11 +7065,6 @@
           <w:lang w:val="es-ES"/>
         </w:rPr>
         <w:t xml:space="preserve">Cualquier uso de datos personales de clientes, empleados o terceros se debe llevar a cabo cumpliendo la normativa aplicable normativas de protección de datos personales </w:t>
-      </w:r>
-      <w:r>
-        <w:rPr>
-          <w:lang w:val="es-ES"/>
-        </w:rPr>
         <w:lastRenderedPageBreak/>
         <w:t>(ej., RGPD, LOPDGDD) y las personas interesadas deben estar convenientemente informadas sobre uso.</w:t>
       </w:r>
@@ -9870,37 +7194,7 @@
         <w:rPr>
           <w:lang w:val="es-ES_tradnl"/>
         </w:rPr>
-        <w:t>La Dirección</w:t>
-      </w:r>
-      <w:r>
-        <w:rPr>
-          <w:lang w:val="es-ES_tradnl"/>
-        </w:rPr>
-        <w:t xml:space="preserve"> de</w:t>
-      </w:r>
-      <w:r>
-        <w:rPr>
-          <w:lang w:val="es-ES_tradnl"/>
-        </w:rPr>
-        <w:t xml:space="preserve"> </w:t>
-      </w:r>
-      <w:r>
-        <w:rPr>
-          <w:lang w:val="es-ES_tradnl"/>
-        </w:rPr>
-        <w:t>OPTIM</w:t>
-      </w:r>
-      <w:r>
-        <w:rPr>
-          <w:lang w:val="es-ES_tradnl"/>
-        </w:rPr>
-        <w:t xml:space="preserve"> TECH</w:t>
-      </w:r>
-      <w:r>
-        <w:rPr>
-          <w:lang w:val="es-ES_tradnl"/>
-        </w:rPr>
-        <w:t xml:space="preserve"> debe revisar y aprobar el uso de cualquier herramienta de IA que presente implicaciones legales, especialmente aquellas que utilicen datos personales.</w:t>
+        <w:t>La Dirección de OPTIM TECH debe revisar y aprobar el uso de cualquier herramienta de IA que presente implicaciones legales, especialmente aquellas que utilicen datos personales.</w:t>
       </w:r>
     </w:p>
     <w:p>
@@ -9971,13 +7265,7 @@
         <w:rPr>
           <w:lang w:val="es-ES_tradnl"/>
         </w:rPr>
-        <w:t xml:space="preserve">Privacidad en el uso del correo electrónico, equipos y medios informáticos de </w:t>
-      </w:r>
-      <w:r>
-        <w:rPr>
-          <w:lang w:val="es-ES_tradnl"/>
-        </w:rPr>
-        <w:t>OPTIM TECH</w:t>
+        <w:t>Privacidad en el uso del correo electrónico, equipos y medios informáticos de OPTIM TECH</w:t>
       </w:r>
       <w:bookmarkEnd w:id="67"/>
       <w:bookmarkEnd w:id="68"/>
@@ -10016,21 +7304,7 @@
           <w:rFonts w:cs="Segoe UI"/>
           <w:lang w:val="es-ES"/>
         </w:rPr>
-        <w:t xml:space="preserve">Los equipos corporativos y todas las herramientas de carácter informático suministradas al personal y colaboradores de </w:t>
-      </w:r>
-      <w:r>
-        <w:rPr>
-          <w:rFonts w:cs="Segoe UI"/>
-          <w:lang w:val="es-ES"/>
-        </w:rPr>
-        <w:t>OPTIM TECH</w:t>
-      </w:r>
-      <w:r>
-        <w:rPr>
-          <w:rFonts w:cs="Segoe UI"/>
-          <w:lang w:val="es-ES"/>
-        </w:rPr>
-        <w:t>, incluyendo las cuentas de correo electrónico, se deben utilizar únicamente con fines corporativos y para llevar a cabo las actividades laborales o profesionales encomendadas, estando absolutamente prohibido su uso personal o fines privados.</w:t>
+        <w:t>Los equipos corporativos y todas las herramientas de carácter informático suministradas al personal y colaboradores de OPTIM TECH, incluyendo las cuentas de correo electrónico, se deben utilizar únicamente con fines corporativos y para llevar a cabo las actividades laborales o profesionales encomendadas, estando absolutamente prohibido su uso personal o fines privados.</w:t>
       </w:r>
     </w:p>
     <w:p>
@@ -10065,21 +7339,7 @@
           <w:rFonts w:cs="Segoe UI"/>
           <w:lang w:val="es-ES_tradnl"/>
         </w:rPr>
-        <w:t xml:space="preserve">Toda la información creada, almacenada y/o enviada desde los equipos y sistemas informáticos de </w:t>
-      </w:r>
-      <w:r>
-        <w:rPr>
-          <w:rFonts w:cs="Segoe UI"/>
-          <w:lang w:val="es-ES_tradnl"/>
-        </w:rPr>
-        <w:t>OPTIM TECH</w:t>
-      </w:r>
-      <w:r>
-        <w:rPr>
-          <w:rFonts w:cs="Segoe UI"/>
-          <w:lang w:val="es-ES_tradnl"/>
-        </w:rPr>
-        <w:t xml:space="preserve"> es propiedad exclusiva de ésta. </w:t>
+        <w:t xml:space="preserve">Toda la información creada, almacenada y/o enviada desde los equipos y sistemas informáticos de OPTIM TECH es propiedad exclusiva de ésta. </w:t>
       </w:r>
     </w:p>
     <w:p>
@@ -10100,21 +7360,7 @@
           <w:rFonts w:cs="Segoe UI"/>
           <w:lang w:val="es-ES_tradnl"/>
         </w:rPr>
-        <w:t xml:space="preserve">Por estos motivos no puede existir expectativa razonable de privacidad en el uso y contenido de los correos electrónicos intercambiados, equipos, medios y soportes informáticos de </w:t>
-      </w:r>
-      <w:r>
-        <w:rPr>
-          <w:rFonts w:cs="Segoe UI"/>
-          <w:lang w:val="es-ES_tradnl"/>
-        </w:rPr>
-        <w:t>OPTIM TECH</w:t>
-      </w:r>
-      <w:r>
-        <w:rPr>
-          <w:rFonts w:cs="Segoe UI"/>
-          <w:lang w:val="es-ES_tradnl"/>
-        </w:rPr>
-        <w:t>.</w:t>
+        <w:t>Por estos motivos no puede existir expectativa razonable de privacidad en el uso y contenido de los correos electrónicos intercambiados, equipos, medios y soportes informáticos de OPTIM TECH.</w:t>
       </w:r>
     </w:p>
     <w:p>
@@ -10136,21 +7382,7 @@
           <w:lang w:val="es-ES_tradnl"/>
         </w:rPr>
         <w:lastRenderedPageBreak/>
-        <w:t xml:space="preserve">Se advierte a las personas trabajadoras de que cualquier uso privado de los equipos informáticos puede quedar registrado (por ejemplo, en el historial de navegación y ficheros descargados) y puede ser accesible por parte de otras personas autorizadas dentro de </w:t>
-      </w:r>
-      <w:r>
-        <w:rPr>
-          <w:rFonts w:cs="Segoe UI"/>
-          <w:lang w:val="es-ES_tradnl"/>
-        </w:rPr>
-        <w:t>OPTIM TECH</w:t>
-      </w:r>
-      <w:r>
-        <w:rPr>
-          <w:rFonts w:cs="Segoe UI"/>
-          <w:lang w:val="es-ES_tradnl"/>
-        </w:rPr>
-        <w:t>.</w:t>
+        <w:t>Se advierte a las personas trabajadoras de que cualquier uso privado de los equipos informáticos puede quedar registrado (por ejemplo, en el historial de navegación y ficheros descargados) y puede ser accesible por parte de otras personas autorizadas dentro de OPTIM TECH.</w:t>
       </w:r>
     </w:p>
     <w:p>
@@ -10171,14 +7403,7 @@
           <w:rFonts w:cs="Segoe UI"/>
           <w:lang w:val="es-ES_tradnl"/>
         </w:rPr>
-        <w:t>OPTIM TECH</w:t>
-      </w:r>
-      <w:r>
-        <w:rPr>
-          <w:rFonts w:cs="Segoe UI"/>
-          <w:lang w:val="es-ES_tradnl"/>
-        </w:rPr>
-        <w:t xml:space="preserve"> tiene derecho a supervisar el uso correcto por parte de los empleados y colaboradores del correo y otros medios informáticos proporcionados con el fin de adoptar medidas de vigilancia y control del cumplimiento laboral de los trabajadores de acuerdo con el artículo 20.3 del Estatuto de los Trabajadores.</w:t>
+        <w:t>OPTIM TECH tiene derecho a supervisar el uso correcto por parte de los empleados y colaboradores del correo y otros medios informáticos proporcionados con el fin de adoptar medidas de vigilancia y control del cumplimiento laboral de los trabajadores de acuerdo con el artículo 20.3 del Estatuto de los Trabajadores.</w:t>
       </w:r>
     </w:p>
     <w:p>
@@ -10220,14 +7445,7 @@
           <w:rFonts w:cs="Segoe UI"/>
           <w:lang w:val="es-ES"/>
         </w:rPr>
-        <w:t>OPTIM TECH</w:t>
-      </w:r>
-      <w:r>
-        <w:rPr>
-          <w:rFonts w:cs="Segoe UI"/>
-          <w:lang w:val="es-ES"/>
-        </w:rPr>
-        <w:t xml:space="preserve"> podrá solicitar la autorización de la persona trabajadora para poder acceder a todos los mensajes del correo corporativo, tanto a los abiertos como a los pendientes de abrir, del buzón de correo asignado a la persona trabajadora, ya sea en caso de baja temporal o incluso una vez finalizada la relación contractual entre ambas partes, con el fin de recuperar información relevante para el negocio que pudiera estar contenida en los buzones del correo asignado a la persona trabajadora. A este respecto, este acceso a los mensajes solamente se podrá hacer de forma justificada y ponderada, y siempre respetando los derechos prevalentes de la persona trabajadora. </w:t>
+        <w:t xml:space="preserve">OPTIM TECH podrá solicitar la autorización de la persona trabajadora para poder acceder a todos los mensajes del correo corporativo, tanto a los abiertos como a los pendientes de abrir, del buzón de correo asignado a la persona trabajadora, ya sea en caso de baja temporal o incluso una vez finalizada la relación contractual entre ambas partes, con el fin de recuperar información relevante para el negocio que pudiera estar contenida en los buzones del correo asignado a la persona trabajadora. A este respecto, este acceso a los mensajes solamente se podrá hacer de forma justificada y ponderada, y siempre respetando los derechos prevalentes de la persona trabajadora. </w:t>
       </w:r>
     </w:p>
     <w:p>
@@ -10246,25 +7464,7 @@
         <w:rPr>
           <w:lang w:val="es-ES"/>
         </w:rPr>
-        <w:t>OPTIM TECH</w:t>
-      </w:r>
-      <w:r>
-        <w:rPr>
-          <w:lang w:val="es-ES"/>
-        </w:rPr>
-        <w:t xml:space="preserve"> informa a la persona trabajadora que, con esta comunicación, la empresa adquiere el derecho a cumplir con su obligación de monitorizar y vigilar el rendimiento y seguridad de sus redes y sistemas informáticos, así como la de velar por la seguridad de la información de la que es propietaria, para lo cual puede implantar los controles de auditoría que en cada momento considere más adecuados para esta finalidad. Sin embargo, </w:t>
-      </w:r>
-      <w:r>
-        <w:rPr>
-          <w:lang w:val="es-ES"/>
-        </w:rPr>
-        <w:t>OPTIM TECH</w:t>
-      </w:r>
-      <w:r>
-        <w:rPr>
-          <w:lang w:val="es-ES"/>
-        </w:rPr>
-        <w:t xml:space="preserve"> reconoce el derecho de la persona trabajadora a ser notificada previamente en el caso de que estos controles vayan a ser utilizados para monitorizar su actividad o el desempeño de sus funciones.</w:t>
+        <w:t>OPTIM TECH informa a la persona trabajadora que, con esta comunicación, la empresa adquiere el derecho a cumplir con su obligación de monitorizar y vigilar el rendimiento y seguridad de sus redes y sistemas informáticos, así como la de velar por la seguridad de la información de la que es propietaria, para lo cual puede implantar los controles de auditoría que en cada momento considere más adecuados para esta finalidad. Sin embargo, OPTIM TECH reconoce el derecho de la persona trabajadora a ser notificada previamente en el caso de que estos controles vayan a ser utilizados para monitorizar su actividad o el desempeño de sus funciones.</w:t>
       </w:r>
     </w:p>
     <w:p>
@@ -10400,12 +7600,6 @@
           <w:lang w:val="es-ES_tradnl"/>
         </w:rPr>
         <w:t xml:space="preserve">Enviar por correo u otros sistemas de mensajería datos personales o cualquier información confidencial tal como números de cuenta bancaria, códigos de verificación, números de tarjeta </w:t>
-      </w:r>
-      <w:r>
-        <w:rPr>
-          <w:rFonts w:cs="Segoe UI"/>
-          <w:lang w:val="es-ES_tradnl"/>
-        </w:rPr>
         <w:lastRenderedPageBreak/>
         <w:t>de crédito, información económica u otra a destinatarios no verificados o con los que no exista tenga una relación habitual y ordinaria.</w:t>
       </w:r>
@@ -10574,37 +7768,7 @@
         <w:rPr>
           <w:lang w:val="es-ES_tradnl"/>
         </w:rPr>
-        <w:t xml:space="preserve">Utilizar herramientas de IA que no hayan sido </w:t>
-      </w:r>
-      <w:r>
-        <w:rPr>
-          <w:lang w:val="es-ES_tradnl"/>
-        </w:rPr>
-        <w:t>homologadas</w:t>
-      </w:r>
-      <w:r>
-        <w:rPr>
-          <w:lang w:val="es-ES_tradnl"/>
-        </w:rPr>
-        <w:t xml:space="preserve"> para su uso </w:t>
-      </w:r>
-      <w:r>
-        <w:rPr>
-          <w:lang w:val="es-ES_tradnl"/>
-        </w:rPr>
-        <w:t>dentro de</w:t>
-      </w:r>
-      <w:r>
-        <w:rPr>
-          <w:lang w:val="es-ES_tradnl"/>
-        </w:rPr>
-        <w:t xml:space="preserve"> la organización</w:t>
-      </w:r>
-      <w:r>
-        <w:rPr>
-          <w:lang w:val="es-ES_tradnl"/>
-        </w:rPr>
-        <w:t xml:space="preserve">. </w:t>
+        <w:t xml:space="preserve">Utilizar herramientas de IA que no hayan sido homologadas para su uso dentro de la organización. </w:t>
       </w:r>
     </w:p>
     <w:p>
@@ -10624,28 +7788,7 @@
           <w:rFonts w:cs="Segoe UI"/>
           <w:lang w:val="es-ES"/>
         </w:rPr>
-        <w:t>dev</w:t>
-      </w:r>
-      <w:r>
-        <w:rPr>
-          <w:rFonts w:cs="Segoe UI"/>
-          <w:lang w:val="es-ES"/>
-        </w:rPr>
-        <w:t>@optimtech.</w:t>
-      </w:r>
-      <w:r>
-        <w:rPr>
-          <w:rFonts w:cs="Segoe UI"/>
-          <w:lang w:val="es-ES"/>
-        </w:rPr>
-        <w:t>es</w:t>
-      </w:r>
-      <w:r>
-        <w:rPr>
-          <w:rFonts w:cs="Segoe UI"/>
-          <w:lang w:val="es-ES"/>
-        </w:rPr>
-        <w:t>.</w:t>
+        <w:t>dev@optimtech.es.</w:t>
       </w:r>
     </w:p>
     <w:p>
@@ -10678,49 +7821,7 @@
           <w:rFonts w:cs="Segoe UI"/>
           <w:lang w:val="es-ES"/>
         </w:rPr>
-        <w:t xml:space="preserve">En el caso del personal propio de </w:t>
-      </w:r>
-      <w:r>
-        <w:rPr>
-          <w:rFonts w:cs="Segoe UI"/>
-          <w:lang w:val="es-ES"/>
-        </w:rPr>
-        <w:t>OPTIM TECH</w:t>
-      </w:r>
-      <w:r>
-        <w:rPr>
-          <w:rFonts w:cs="Segoe UI"/>
-          <w:lang w:val="es-ES"/>
-        </w:rPr>
-        <w:t xml:space="preserve">, el incumplimiento de esta normativa se considerará como falta por indisciplina o desobediencia en el trabajo en los términos que establece el Estatuto de los Trabajadores, y será sancionada teniendo en cuenta el impacto del incumplimiento para </w:t>
-      </w:r>
-      <w:r>
-        <w:rPr>
-          <w:rFonts w:cs="Segoe UI"/>
-          <w:lang w:val="es-ES"/>
-        </w:rPr>
-        <w:t>OPTIM TECH</w:t>
-      </w:r>
-      <w:r>
-        <w:rPr>
-          <w:rFonts w:cs="Segoe UI"/>
-          <w:lang w:val="es-ES"/>
-        </w:rPr>
-        <w:t xml:space="preserve">, las sanciones o repercusiones que pudiera tener para </w:t>
-      </w:r>
-      <w:r>
-        <w:rPr>
-          <w:rFonts w:cs="Segoe UI"/>
-          <w:lang w:val="es-ES"/>
-        </w:rPr>
-        <w:t>OPTIM TECH</w:t>
-      </w:r>
-      <w:r>
-        <w:rPr>
-          <w:rFonts w:cs="Segoe UI"/>
-          <w:lang w:val="es-ES"/>
-        </w:rPr>
-        <w:t xml:space="preserve"> y su reputación, así como la graduación de faltas y sanciones que se establezcan en las disposiciones legales o en el convenio colectivo que sea aplicable.</w:t>
+        <w:t>En el caso del personal propio de OPTIM TECH, el incumplimiento de esta normativa se considerará como falta por indisciplina o desobediencia en el trabajo en los términos que establece el Estatuto de los Trabajadores, y será sancionada teniendo en cuenta el impacto del incumplimiento para OPTIM TECH, las sanciones o repercusiones que pudiera tener para OPTIM TECH y su reputación, así como la graduación de faltas y sanciones que se establezcan en las disposiciones legales o en el convenio colectivo que sea aplicable.</w:t>
       </w:r>
     </w:p>
     <w:p>
@@ -10750,35 +7851,7 @@
           <w:rFonts w:cs="Segoe UI"/>
           <w:lang w:val="es-ES"/>
         </w:rPr>
-        <w:t xml:space="preserve">Asimismo, se notifica a la persona trabajadora que </w:t>
-      </w:r>
-      <w:r>
-        <w:rPr>
-          <w:rFonts w:cs="Segoe UI"/>
-          <w:lang w:val="es-ES"/>
-        </w:rPr>
-        <w:t>OPTIM TECH</w:t>
-      </w:r>
-      <w:r>
-        <w:rPr>
-          <w:rFonts w:cs="Segoe UI"/>
-          <w:lang w:val="es-ES"/>
-        </w:rPr>
-        <w:t xml:space="preserve"> se reserva la potestad de reclamar que le sean resarcidos los daños y perjuicios causados ​​como consecuencia de su vulneración de estas obligaciones y teniendo en cuenta e impacto del incumplimiento tanto en la privacidad de los datos de los afectados como a las sanciones o repercusiones que pudiera tener para </w:t>
-      </w:r>
-      <w:r>
-        <w:rPr>
-          <w:rFonts w:cs="Segoe UI"/>
-          <w:lang w:val="es-ES"/>
-        </w:rPr>
-        <w:t>OPTIM TECH</w:t>
-      </w:r>
-      <w:r>
-        <w:rPr>
-          <w:rFonts w:cs="Segoe UI"/>
-          <w:lang w:val="es-ES"/>
-        </w:rPr>
-        <w:t xml:space="preserve"> y su reputación.</w:t>
+        <w:t>Asimismo, se notifica a la persona trabajadora que OPTIM TECH se reserva la potestad de reclamar que le sean resarcidos los daños y perjuicios causados ​​como consecuencia de su vulneración de estas obligaciones y teniendo en cuenta e impacto del incumplimiento tanto en la privacidad de los datos de los afectados como a las sanciones o repercusiones que pudiera tener para OPTIM TECH y su reputación.</w:t>
       </w:r>
     </w:p>
     <w:p>
@@ -10968,42 +8041,21 @@
           <w:rFonts w:cs="Segoe UI"/>
           <w:lang w:val="es-ES_tradnl"/>
         </w:rPr>
-        <w:t xml:space="preserve">Esta normativa puede complementarse con otras medidas adicionales que </w:t>
-      </w:r>
-      <w:r>
-        <w:rPr>
-          <w:rFonts w:cs="Segoe UI"/>
-          <w:lang w:val="es-ES_tradnl"/>
-        </w:rPr>
-        <w:t>OPTIM TECH</w:t>
-      </w:r>
-      <w:r>
-        <w:rPr>
-          <w:rFonts w:cs="Segoe UI"/>
-          <w:lang w:val="es-ES_tradnl"/>
-        </w:rPr>
-        <w:t xml:space="preserve"> pueda establecer para contemplar situaciones en las que existan riesgos específicos para la seguridad de la información o la privacidad de los datos personales. </w:t>
-      </w:r>
-    </w:p>
-    <w:p>
-      <w:pPr>
-        <w:rPr>
-          <w:lang w:val="es-ES_tradnl"/>
-        </w:rPr>
-      </w:pPr>
-      <w:r>
-        <w:rPr>
-          <w:rFonts w:cs="Segoe UI"/>
-          <w:lang w:val="es-ES_tradnl"/>
-        </w:rPr>
-        <w:t>OPTIM TECH</w:t>
-      </w:r>
-      <w:r>
-        <w:rPr>
-          <w:rFonts w:cs="Segoe UI"/>
-          <w:lang w:val="es-ES_tradnl"/>
-        </w:rPr>
-        <w:t xml:space="preserve"> se reserva el derecho de modificar o actualizar estas políticas y obligaciones en cualquier momento y a su exclusivo criterio. La persona trabajadora será notificada cuando exista alguna modificación para que pueda ejercer su derecho a objeción. Dichas modificaciones estarán vigentes a partir del momento en el que se produzca la notificación</w:t>
+        <w:t xml:space="preserve">Esta normativa puede complementarse con otras medidas adicionales que OPTIM TECH pueda establecer para contemplar situaciones en las que existan riesgos específicos para la seguridad de la información o la privacidad de los datos personales. </w:t>
+      </w:r>
+    </w:p>
+    <w:p>
+      <w:pPr>
+        <w:rPr>
+          <w:lang w:val="es-ES_tradnl"/>
+        </w:rPr>
+      </w:pPr>
+      <w:r>
+        <w:rPr>
+          <w:rFonts w:cs="Segoe UI"/>
+          <w:lang w:val="es-ES_tradnl"/>
+        </w:rPr>
+        <w:t>OPTIM TECH se reserva el derecho de modificar o actualizar estas políticas y obligaciones en cualquier momento y a su exclusivo criterio. La persona trabajadora será notificada cuando exista alguna modificación para que pueda ejercer su derecho a objeción. Dichas modificaciones estarán vigentes a partir del momento en el que se produzca la notificación</w:t>
       </w:r>
     </w:p>
     <w:p>
@@ -11357,16 +8409,7 @@
                 <w:szCs w:val="18"/>
                 <w:lang w:val="es-ES_tradnl"/>
               </w:rPr>
-              <w:t>1</w:t>
-            </w:r>
-            <w:r>
-              <w:rPr>
-                <w:rFonts w:ascii="CIDFont+F1" w:hAnsi="CIDFont+F1" w:cs="CIDFont+F1"/>
-                <w:sz w:val="18"/>
-                <w:szCs w:val="18"/>
-                <w:lang w:val="es-ES_tradnl"/>
-              </w:rPr>
-              <w:t>.0</w:t>
+              <w:t>1.0</w:t>
             </w:r>
           </w:p>
         </w:tc>
@@ -11444,16 +8487,7 @@
                 <w:szCs w:val="18"/>
                 <w:lang w:val="es-ES_tradnl"/>
               </w:rPr>
-              <w:t>J</w:t>
-            </w:r>
-            <w:r>
-              <w:rPr>
-                <w:rFonts w:ascii="CIDFont+F1" w:hAnsi="CIDFont+F1" w:cs="CIDFont+F1"/>
-                <w:sz w:val="18"/>
-                <w:szCs w:val="18"/>
-                <w:lang w:val="es-ES_tradnl"/>
-              </w:rPr>
-              <w:t>R</w:t>
+              <w:t>JR</w:t>
             </w:r>
           </w:p>
         </w:tc>
@@ -11879,84 +8913,238 @@
 </file>
 
 <file path=word/header2.xml><?xml version="1.0" encoding="utf-8"?>
-<w:hdr xmlns:wpc="http://schemas.microsoft.com/office/word/2010/wordprocessingCanvas" xmlns:cx="http://schemas.microsoft.com/office/drawing/2014/chartex" xmlns:cx1="http://schemas.microsoft.com/office/drawing/2015/9/8/chartex" xmlns:cx2="http://schemas.microsoft.com/office/drawing/2015/10/21/chartex" xmlns:cx3="http://schemas.microsoft.com/office/drawing/2016/5/9/chartex" xmlns:cx4="http://schemas.microsoft.com/office/drawing/2016/5/10/chartex" xmlns:cx5="http://schemas.microsoft.com/office/drawing/2016/5/11/chartex" xmlns:cx6="http://schemas.microsoft.com/office/drawing/2016/5/12/chartex" xmlns:cx7="http://schemas.microsoft.com/office/drawing/2016/5/13/chartex" xmlns:cx8="http://schemas.microsoft.com/office/drawing/2016/5/14/chartex" xmlns:mc="http://schemas.openxmlformats.org/markup-compatibility/2006" xmlns:aink="http://schemas.microsoft.com/office/drawing/2016/ink" xmlns:am3d="http://schemas.microsoft.com/office/drawing/2017/model3d" xmlns:o="urn:schemas-microsoft-com:office:office" xmlns:oel="http://schemas.microsoft.com/office/2019/extlst" xmlns:r="http://schemas.openxmlformats.org/officeDocument/2006/relationships" xmlns:m="http://schemas.openxmlformats.org/officeDocument/2006/math" xmlns:v="urn:schemas-microsoft-com:vml" xmlns:wp14="http://schemas.microsoft.com/office/word/2010/wordprocessingDrawing" xmlns:wp="http://schemas.openxmlformats.org/drawingml/2006/wordprocessingDrawing" xmlns:w10="urn:schemas-microsoft-com:office:word" xmlns:w="http://schemas.openxmlformats.org/wordprocessingml/2006/main" xmlns:w14="http://schemas.microsoft.com/office/word/2010/wordml" xmlns:w15="http://schemas.microsoft.com/office/word/2012/wordml" xmlns:w16cex="http://schemas.microsoft.com/office/word/2018/wordml/cex" xmlns:w16cid="http://schemas.microsoft.com/office/word/2016/wordml/cid" xmlns:w16="http://schemas.microsoft.com/office/word/2018/wordml" xmlns:w16du="http://schemas.microsoft.com/office/word/2023/wordml/word16du" xmlns:w16sdtdh="http://schemas.microsoft.com/office/word/2020/wordml/sdtdatahash" xmlns:w16se="http://schemas.microsoft.com/office/word/2015/wordml/symex" xmlns:wpg="http://schemas.microsoft.com/office/word/2010/wordprocessingGroup" xmlns:wpi="http://schemas.microsoft.com/office/word/2010/wordprocessingInk" xmlns:wne="http://schemas.microsoft.com/office/word/2006/wordml" xmlns:wps="http://schemas.microsoft.com/office/word/2010/wordprocessingShape" mc:Ignorable="w14 w15 w16se w16cid w16 w16cex w16sdtdh w16du wp14">
+<w:hdr xmlns:wpc="http://schemas.microsoft.com/office/word/2010/wordprocessingCanvas" xmlns:cx="http://schemas.microsoft.com/office/drawing/2014/chartex" xmlns:cx1="http://schemas.microsoft.com/office/drawing/2015/9/8/chartex" xmlns:cx2="http://schemas.microsoft.com/office/drawing/2015/10/21/chartex" xmlns:cx3="http://schemas.microsoft.com/office/drawing/2016/5/9/chartex" xmlns:cx4="http://schemas.microsoft.com/office/drawing/2016/5/10/chartex" xmlns:cx5="http://schemas.microsoft.com/office/drawing/2016/5/11/chartex" xmlns:cx6="http://schemas.microsoft.com/office/drawing/2016/5/12/chartex" xmlns:cx7="http://schemas.microsoft.com/office/drawing/2016/5/13/chartex" xmlns:cx8="http://schemas.microsoft.com/office/drawing/2016/5/14/chartex" xmlns:mc="http://schemas.openxmlformats.org/markup-compatibility/2006" xmlns:aink="http://schemas.microsoft.com/office/drawing/2016/ink" xmlns:am3d="http://schemas.microsoft.com/office/drawing/2017/model3d" xmlns:o="urn:schemas-microsoft-com:office:office" xmlns:oel="http://schemas.microsoft.com/office/2019/extlst" xmlns:r="http://schemas.openxmlformats.org/officeDocument/2006/relationships" xmlns:m="http://schemas.openxmlformats.org/officeDocument/2006/math" xmlns:v="urn:schemas-microsoft-com:vml" xmlns:wp14="http://schemas.microsoft.com/office/word/2010/wordprocessingDrawing" xmlns:wp="http://schemas.openxmlformats.org/drawingml/2006/wordprocessingDrawing" xmlns:w10="urn:schemas-microsoft-com:office:word" xmlns:w="http://schemas.openxmlformats.org/wordprocessingml/2006/main" xmlns:w14="http://schemas.microsoft.com/office/word/2010/wordml" xmlns:w15="http://schemas.microsoft.com/office/word/2012/wordml" xmlns:w16cex="http://schemas.microsoft.com/office/word/2018/wordml/cex" xmlns:w16cid="http://schemas.microsoft.com/office/word/2016/wordml/cid" xmlns:w16="http://schemas.microsoft.com/office/word/2018/wordml" xmlns:w16sdtdh="http://schemas.microsoft.com/office/word/2020/wordml/sdtdatahash" xmlns:w16se="http://schemas.microsoft.com/office/word/2015/wordml/symex" xmlns:wpg="http://schemas.microsoft.com/office/word/2010/wordprocessingGroup" xmlns:wpi="http://schemas.microsoft.com/office/word/2010/wordprocessingInk" xmlns:wne="http://schemas.microsoft.com/office/word/2006/wordml" xmlns:wps="http://schemas.microsoft.com/office/word/2010/wordprocessingShape" mc:Ignorable="w14 w15 w16se w16cid w16 w16cex w16sdtdh wp14">
+  <w:tbl>
+    <w:tblPr>
+      <w:tblW w:w="9348" w:type="dxa"/>
+      <w:tblBorders>
+        <w:top w:val="single" w:sz="6" w:space="0" w:color="BFBFBF"/>
+        <w:left w:val="single" w:sz="6" w:space="0" w:color="BFBFBF"/>
+        <w:bottom w:val="single" w:sz="6" w:space="0" w:color="BFBFBF"/>
+        <w:right w:val="single" w:sz="6" w:space="0" w:color="BFBFBF"/>
+        <w:insideH w:val="single" w:sz="6" w:space="0" w:color="BFBFBF"/>
+        <w:insideV w:val="single" w:sz="6" w:space="0" w:color="BFBFBF"/>
+      </w:tblBorders>
+      <w:tblLayout w:type="fixed"/>
+      <w:tblCellMar>
+        <w:left w:w="70" w:type="dxa"/>
+        <w:right w:w="70" w:type="dxa"/>
+      </w:tblCellMar>
+      <w:tblLook w:val="0000" w:firstRow="0" w:lastRow="0" w:firstColumn="0" w:lastColumn="0" w:noHBand="0" w:noVBand="0"/>
+    </w:tblPr>
+    <w:tblGrid>
+      <w:gridCol w:w="3394"/>
+      <w:gridCol w:w="3230"/>
+      <w:gridCol w:w="2724"/>
+    </w:tblGrid>
+    <w:tr>
+      <w:trPr>
+        <w:trHeight w:val="735"/>
+      </w:trPr>
+      <w:tc>
+        <w:tcPr>
+          <w:tcW w:w="3394" w:type="dxa"/>
+          <w:vMerge w:val="restart"/>
+          <w:tcBorders>
+            <w:top w:val="single" w:sz="6" w:space="0" w:color="BFBFBF"/>
+            <w:left w:val="single" w:sz="6" w:space="0" w:color="BFBFBF"/>
+            <w:bottom w:val="single" w:sz="6" w:space="0" w:color="BFBFBF"/>
+            <w:right w:val="single" w:sz="6" w:space="0" w:color="BFBFBF"/>
+          </w:tcBorders>
+          <w:vAlign w:val="center"/>
+        </w:tcPr>
+        <w:p>
+          <w:pPr>
+            <w:spacing w:before="120" w:after="20" w:line="240" w:lineRule="auto"/>
+            <w:ind w:left="170" w:right="360"/>
+            <w:jc w:val="center"/>
+            <w:rPr>
+              <w:rFonts w:ascii="Segoe UI" w:eastAsia="Roboto Light" w:hAnsi="Segoe UI" w:cs="Segoe UI"/>
+              <w:b/>
+              <w:bCs/>
+            </w:rPr>
+          </w:pPr>
+          <w:r>
+            <w:rPr>
+              <w:rFonts w:eastAsia="MS Mincho" w:cs="Arial"/>
+              <w:noProof/>
+            </w:rPr>
+            <w:drawing>
+              <wp:anchor distT="0" distB="0" distL="114300" distR="114300" simplePos="0" relativeHeight="251659264" behindDoc="0" locked="0" layoutInCell="1" allowOverlap="1" wp14:anchorId="0525BA4F" wp14:editId="136918A8">
+                <wp:simplePos x="0" y="0"/>
+                <wp:positionH relativeFrom="column">
+                  <wp:posOffset>196850</wp:posOffset>
+                </wp:positionH>
+                <wp:positionV relativeFrom="paragraph">
+                  <wp:posOffset>-20955</wp:posOffset>
+                </wp:positionV>
+                <wp:extent cx="1548130" cy="641350"/>
+                <wp:effectExtent l="0" t="0" r="0" b="0"/>
+                <wp:wrapNone/>
+                <wp:docPr id="1358115082" name="Imatge 1358115082"/>
+                <wp:cNvGraphicFramePr>
+                  <a:graphicFrameLocks xmlns:a="http://schemas.openxmlformats.org/drawingml/2006/main" noChangeAspect="1"/>
+                </wp:cNvGraphicFramePr>
+                <a:graphic xmlns:a="http://schemas.openxmlformats.org/drawingml/2006/main">
+                  <a:graphicData uri="http://schemas.openxmlformats.org/drawingml/2006/picture">
+                    <pic:pic xmlns:pic="http://schemas.openxmlformats.org/drawingml/2006/picture">
+                      <pic:nvPicPr>
+                        <pic:cNvPr id="2" name="Imatge 1"/>
+                        <pic:cNvPicPr>
+                          <a:picLocks noChangeAspect="1"/>
+                        </pic:cNvPicPr>
+                      </pic:nvPicPr>
+                      <pic:blipFill>
+                        <a:blip r:embed="rId1" cstate="print">
+                          <a:extLst>
+                            <a:ext uri="{28A0092B-C50C-407E-A947-70E740481C1C}">
+                              <a14:useLocalDpi xmlns:a14="http://schemas.microsoft.com/office/drawing/2010/main" val="0"/>
+                            </a:ext>
+                          </a:extLst>
+                        </a:blip>
+                        <a:stretch>
+                          <a:fillRect/>
+                        </a:stretch>
+                      </pic:blipFill>
+                      <pic:spPr>
+                        <a:xfrm>
+                          <a:off x="0" y="0"/>
+                          <a:ext cx="1548130" cy="641350"/>
+                        </a:xfrm>
+                        <a:prstGeom prst="rect">
+                          <a:avLst/>
+                        </a:prstGeom>
+                      </pic:spPr>
+                    </pic:pic>
+                  </a:graphicData>
+                </a:graphic>
+              </wp:anchor>
+            </w:drawing>
+          </w:r>
+        </w:p>
+      </w:tc>
+      <w:tc>
+        <w:tcPr>
+          <w:tcW w:w="5954" w:type="dxa"/>
+          <w:gridSpan w:val="2"/>
+          <w:tcBorders>
+            <w:top w:val="single" w:sz="6" w:space="0" w:color="BFBFBF"/>
+            <w:left w:val="single" w:sz="6" w:space="0" w:color="BFBFBF"/>
+            <w:bottom w:val="single" w:sz="6" w:space="0" w:color="BFBFBF"/>
+            <w:right w:val="single" w:sz="6" w:space="0" w:color="BFBFBF"/>
+          </w:tcBorders>
+          <w:vAlign w:val="center"/>
+        </w:tcPr>
+        <w:p>
+          <w:pPr>
+            <w:spacing w:before="60" w:after="60" w:line="240" w:lineRule="auto"/>
+            <w:jc w:val="center"/>
+            <w:rPr>
+              <w:rFonts w:ascii="Segoe UI" w:eastAsia="Roboto Light" w:hAnsi="Segoe UI" w:cs="Segoe UI"/>
+              <w:b/>
+              <w:sz w:val="20"/>
+              <w:szCs w:val="20"/>
+            </w:rPr>
+          </w:pPr>
+          <w:r>
+            <w:rPr>
+              <w:rFonts w:ascii="Segoe UI" w:eastAsia="Roboto Light" w:hAnsi="Segoe UI" w:cs="Segoe UI"/>
+              <w:b/>
+              <w:color w:val="808080"/>
+              <w:sz w:val="20"/>
+              <w:szCs w:val="20"/>
+            </w:rPr>
+            <w:t>NORMATIVA DE SEGURIDAD DE LA INFORMACIÓN</w:t>
+          </w:r>
+        </w:p>
+      </w:tc>
+    </w:tr>
+    <w:tr>
+      <w:trPr>
+        <w:trHeight w:val="547"/>
+      </w:trPr>
+      <w:tc>
+        <w:tcPr>
+          <w:tcW w:w="3394" w:type="dxa"/>
+          <w:vMerge/>
+          <w:tcBorders>
+            <w:top w:val="single" w:sz="6" w:space="0" w:color="BFBFBF"/>
+            <w:left w:val="single" w:sz="6" w:space="0" w:color="BFBFBF"/>
+            <w:bottom w:val="single" w:sz="6" w:space="0" w:color="BFBFBF"/>
+            <w:right w:val="single" w:sz="6" w:space="0" w:color="BFBFBF"/>
+          </w:tcBorders>
+          <w:vAlign w:val="center"/>
+        </w:tcPr>
+        <w:p>
+          <w:pPr>
+            <w:spacing w:before="120" w:after="20" w:line="240" w:lineRule="auto"/>
+            <w:ind w:left="170" w:right="360"/>
+            <w:jc w:val="center"/>
+          </w:pPr>
+        </w:p>
+      </w:tc>
+      <w:tc>
+        <w:tcPr>
+          <w:tcW w:w="3230" w:type="dxa"/>
+          <w:tcBorders>
+            <w:top w:val="single" w:sz="6" w:space="0" w:color="BFBFBF"/>
+            <w:left w:val="single" w:sz="6" w:space="0" w:color="BFBFBF"/>
+            <w:bottom w:val="single" w:sz="6" w:space="0" w:color="BFBFBF"/>
+            <w:right w:val="single" w:sz="6" w:space="0" w:color="BFBFBF"/>
+          </w:tcBorders>
+          <w:vAlign w:val="center"/>
+        </w:tcPr>
+        <w:p>
+          <w:pPr>
+            <w:spacing w:before="40" w:after="20" w:line="240" w:lineRule="auto"/>
+            <w:ind w:left="170" w:right="170"/>
+            <w:jc w:val="center"/>
+          </w:pPr>
+          <w:r>
+            <w:rPr>
+              <w:rFonts w:ascii="Segoe UI" w:eastAsia="Roboto Light" w:hAnsi="Segoe UI" w:cs="Segoe UI"/>
+              <w:color w:val="808080"/>
+              <w:sz w:val="18"/>
+              <w:szCs w:val="18"/>
+            </w:rPr>
+            <w:t>I01 Rev.01</w:t>
+          </w:r>
+        </w:p>
+      </w:tc>
+      <w:tc>
+        <w:tcPr>
+          <w:tcW w:w="2724" w:type="dxa"/>
+          <w:tcBorders>
+            <w:top w:val="single" w:sz="6" w:space="0" w:color="BFBFBF"/>
+            <w:left w:val="single" w:sz="6" w:space="0" w:color="BFBFBF"/>
+            <w:bottom w:val="single" w:sz="6" w:space="0" w:color="BFBFBF"/>
+            <w:right w:val="single" w:sz="6" w:space="0" w:color="BFBFBF"/>
+          </w:tcBorders>
+          <w:vAlign w:val="center"/>
+        </w:tcPr>
+        <w:p>
+          <w:pPr>
+            <w:spacing w:before="40" w:after="20" w:line="240" w:lineRule="auto"/>
+            <w:ind w:left="170" w:right="170"/>
+            <w:jc w:val="center"/>
+          </w:pPr>
+          <w:r>
+            <w:rPr>
+              <w:rFonts w:ascii="Segoe UI" w:eastAsia="Roboto Light" w:hAnsi="Segoe UI" w:cs="Segoe UI"/>
+              <w:color w:val="808080"/>
+              <w:sz w:val="18"/>
+              <w:szCs w:val="18"/>
+            </w:rPr>
+            <w:t>USO INTERNO</w:t>
+          </w:r>
+        </w:p>
+      </w:tc>
+    </w:tr>
+  </w:tbl>
   <w:p>
     <w:pPr>
-      <w:pStyle w:val="Capalera"/>
-      <w:spacing w:before="240"/>
+      <w:spacing w:line="240" w:lineRule="auto"/>
     </w:pPr>
-    <w:r>
-      <w:rPr>
-        <w:noProof/>
-      </w:rPr>
-      <w:drawing>
-        <wp:anchor distT="0" distB="0" distL="114300" distR="114300" simplePos="0" relativeHeight="251660288" behindDoc="0" locked="0" layoutInCell="1" allowOverlap="1" wp14:anchorId="016F1827" wp14:editId="4C9EEFEF">
-          <wp:simplePos x="0" y="0"/>
-          <wp:positionH relativeFrom="margin">
-            <wp:align>right</wp:align>
-          </wp:positionH>
-          <wp:positionV relativeFrom="paragraph">
-            <wp:posOffset>4831</wp:posOffset>
-          </wp:positionV>
-          <wp:extent cx="931349" cy="378847"/>
-          <wp:effectExtent l="0" t="0" r="0" b="2540"/>
-          <wp:wrapNone/>
-          <wp:docPr id="912020404" name="Imatge 69" descr="Imatge que conté Gràfics, Font, disseny gràfic, logotip&#10;&#10;Pot ser que el contingut generat per IA no sigui correcte.">
-            <a:extLst xmlns:a="http://schemas.openxmlformats.org/drawingml/2006/main">
-              <a:ext uri="{FF2B5EF4-FFF2-40B4-BE49-F238E27FC236}">
-                <a16:creationId xmlns:a16="http://schemas.microsoft.com/office/drawing/2014/main" id="{899A3455-8683-4654-AC00-ADCEFC899D44}"/>
-              </a:ext>
-            </a:extLst>
-          </wp:docPr>
-          <wp:cNvGraphicFramePr>
-            <a:graphicFrameLocks xmlns:a="http://schemas.openxmlformats.org/drawingml/2006/main" noChangeAspect="1"/>
-          </wp:cNvGraphicFramePr>
-          <a:graphic xmlns:a="http://schemas.openxmlformats.org/drawingml/2006/main">
-            <a:graphicData uri="http://schemas.openxmlformats.org/drawingml/2006/picture">
-              <pic:pic xmlns:pic="http://schemas.openxmlformats.org/drawingml/2006/picture">
-                <pic:nvPicPr>
-                  <pic:cNvPr id="156031891" name="Imatge 69" descr="Imatge que conté Gràfics, Font, disseny gràfic, logotip&#10;&#10;Pot ser que el contingut generat per IA no sigui correcte."/>
-                  <pic:cNvPicPr/>
-                </pic:nvPicPr>
-                <pic:blipFill>
-                  <a:blip r:embed="rId1">
-                    <a:extLst>
-                      <a:ext uri="{28A0092B-C50C-407E-A947-70E740481C1C}">
-                        <a14:useLocalDpi xmlns:a14="http://schemas.microsoft.com/office/drawing/2010/main" val="0"/>
-                      </a:ext>
-                    </a:extLst>
-                  </a:blip>
-                  <a:stretch>
-                    <a:fillRect/>
-                  </a:stretch>
-                </pic:blipFill>
-                <pic:spPr>
-                  <a:xfrm>
-                    <a:off x="0" y="0"/>
-                    <a:ext cx="931349" cy="378847"/>
-                  </a:xfrm>
-                  <a:prstGeom prst="rect">
-                    <a:avLst/>
-                  </a:prstGeom>
-                </pic:spPr>
-              </pic:pic>
-            </a:graphicData>
-          </a:graphic>
-          <wp14:sizeRelH relativeFrom="margin">
-            <wp14:pctWidth>0</wp14:pctWidth>
-          </wp14:sizeRelH>
-          <wp14:sizeRelV relativeFrom="margin">
-            <wp14:pctHeight>0</wp14:pctHeight>
-          </wp14:sizeRelV>
-        </wp:anchor>
-      </w:drawing>
-    </w:r>
-    <w:r>
-      <w:t>USO INTERNO</w:t>
-    </w:r>
-    <w:r>
-      <w:t xml:space="preserve"> </w:t>
-    </w:r>
   </w:p>
 </w:hdr>
 </file>

</xml_diff>